<commit_message>
Backup truoc khi refactor toàn bô du an
</commit_message>
<xml_diff>
--- a/docs/Mình phải tạo ra sản phẩm cá nhân.docx
+++ b/docs/Mình phải tạo ra sản phẩm cá nhân.docx
@@ -14,16 +14,7 @@
           <w:rFonts w:hint="default"/>
           <w:lang w:val="en-US"/>
         </w:rPr>
-        <w:t>Mình phải tạo ra sản phẩm cá nhân</w:t>
-      </w:r>
-      <w:bookmarkStart w:id="0" w:name="_GoBack"/>
-      <w:bookmarkEnd w:id="0"/>
-      <w:r>
-        <w:rPr>
-          <w:rFonts w:hint="default"/>
-          <w:lang w:val="en-US"/>
-        </w:rPr>
-        <w:t xml:space="preserve"> cho môn phát triển hệ thống thương mại điện tử là dùng laravel ( bắt buộc có gợi ý sản phẩm và thanh toán và chủ đề là bán dụng cụ bóng đá), và môn phát triển phần mềm hướng dịch vụ có thể dùng laravel nên mình tính làm 2 môn này là 1 project nhưng theo mô hình môn phát triền phần mềm hướng dịch vụ và đây là mô hình mình đang được học trên lớp </w:t>
+        <w:t xml:space="preserve">Mình phải tạo ra sản phẩm cá nhân cho môn phát triển hệ thống thương mại điện tử là dùng laravel ( bắt buộc có gợi ý sản phẩm và thanh toán và chủ đề là bán dụng cụ bóng đá), và môn phát triển phần mềm hướng dịch vụ có thể dùng laravel nên mình tính làm 2 môn này là 1 project nhưng theo mô hình môn phát triền phần mềm hướng dịch vụ và đây là mô hình mình đang được học trên lớp </w:t>
       </w:r>
       <w:r>
         <w:drawing>
@@ -9631,6 +9622,1992 @@
         </w:rPr>
         <w:t xml:space="preserve">Mình cũng có định hướng lấy project này để sau mở rộng làm đồ án tốt nghiệp luôn. </w:t>
       </w:r>
+    </w:p>
+    <w:p>
+      <w:pPr>
+        <w:rPr>
+          <w:rFonts w:hint="default"/>
+          <w:lang w:val="en-US"/>
+        </w:rPr>
+      </w:pPr>
+    </w:p>
+    <w:p>
+      <w:pPr>
+        <w:rPr>
+          <w:rFonts w:hint="default"/>
+          <w:lang w:val="en-US"/>
+        </w:rPr>
+      </w:pPr>
+    </w:p>
+    <w:p>
+      <w:pPr>
+        <w:rPr>
+          <w:rFonts w:hint="default"/>
+          <w:lang w:val="en-US"/>
+        </w:rPr>
+      </w:pPr>
+    </w:p>
+    <w:p>
+      <w:pPr>
+        <w:rPr>
+          <w:rFonts w:hint="default"/>
+          <w:lang w:val="en-US"/>
+        </w:rPr>
+      </w:pPr>
+    </w:p>
+    <w:tbl>
+      <w:tblPr>
+        <w:tblStyle w:val="3"/>
+        <w:tblW w:w="0" w:type="auto"/>
+        <w:tblCellSpacing w:w="15" w:type="dxa"/>
+        <w:tblInd w:w="10" w:type="dxa"/>
+        <w:tblBorders>
+          <w:top w:val="none" w:color="auto" w:sz="0" w:space="0"/>
+          <w:left w:val="none" w:color="auto" w:sz="0" w:space="0"/>
+          <w:bottom w:val="none" w:color="auto" w:sz="0" w:space="0"/>
+          <w:right w:val="none" w:color="auto" w:sz="0" w:space="0"/>
+          <w:insideH w:val="none" w:color="auto" w:sz="0" w:space="0"/>
+          <w:insideV w:val="none" w:color="auto" w:sz="0" w:space="0"/>
+        </w:tblBorders>
+        <w:shd w:val="clear" w:color="auto" w:fill="auto"/>
+        <w:tblLayout w:type="autofit"/>
+        <w:tblCellMar>
+          <w:top w:w="15" w:type="dxa"/>
+          <w:left w:w="15" w:type="dxa"/>
+          <w:bottom w:w="15" w:type="dxa"/>
+          <w:right w:w="15" w:type="dxa"/>
+        </w:tblCellMar>
+      </w:tblPr>
+      <w:tblGrid>
+        <w:gridCol w:w="1452"/>
+        <w:gridCol w:w="5858"/>
+        <w:gridCol w:w="1354"/>
+      </w:tblGrid>
+      <w:tr>
+        <w:tblPrEx>
+          <w:tblBorders>
+            <w:top w:val="none" w:color="auto" w:sz="0" w:space="0"/>
+            <w:left w:val="none" w:color="auto" w:sz="0" w:space="0"/>
+            <w:bottom w:val="none" w:color="auto" w:sz="0" w:space="0"/>
+            <w:right w:val="none" w:color="auto" w:sz="0" w:space="0"/>
+            <w:insideH w:val="none" w:color="auto" w:sz="0" w:space="0"/>
+            <w:insideV w:val="none" w:color="auto" w:sz="0" w:space="0"/>
+          </w:tblBorders>
+          <w:shd w:val="clear" w:color="auto" w:fill="auto"/>
+          <w:tblCellMar>
+            <w:top w:w="15" w:type="dxa"/>
+            <w:left w:w="15" w:type="dxa"/>
+            <w:bottom w:w="15" w:type="dxa"/>
+            <w:right w:w="15" w:type="dxa"/>
+          </w:tblCellMar>
+        </w:tblPrEx>
+        <w:trPr>
+          <w:tblHeader/>
+          <w:tblCellSpacing w:w="15" w:type="dxa"/>
+        </w:trPr>
+        <w:tc>
+          <w:tcPr>
+            <w:tcW w:w="0" w:type="auto"/>
+            <w:tcBorders>
+              <w:top w:val="single" w:color="C4C7C5" w:sz="4" w:space="0"/>
+              <w:left w:val="single" w:color="C4C7C5" w:sz="4" w:space="0"/>
+              <w:bottom w:val="single" w:color="C4C7C5" w:sz="4" w:space="0"/>
+              <w:right w:val="single" w:color="C4C7C5" w:sz="4" w:space="0"/>
+            </w:tcBorders>
+            <w:shd w:val="clear" w:color="auto" w:fill="auto"/>
+            <w:tcMar>
+              <w:top w:w="96" w:type="dxa"/>
+              <w:left w:w="144" w:type="dxa"/>
+              <w:bottom w:w="96" w:type="dxa"/>
+              <w:right w:w="144" w:type="dxa"/>
+            </w:tcMar>
+            <w:vAlign w:val="center"/>
+          </w:tcPr>
+          <w:p>
+            <w:pPr>
+              <w:keepNext w:val="0"/>
+              <w:keepLines w:val="0"/>
+              <w:widowControl/>
+              <w:suppressLineNumbers w:val="0"/>
+              <w:spacing w:before="0" w:beforeAutospacing="0" w:line="12" w:lineRule="atLeast"/>
+              <w:jc w:val="left"/>
+              <w:rPr>
+                <w:rFonts w:ascii="sans-serif" w:hAnsi="sans-serif" w:eastAsia="sans-serif" w:cs="sans-serif"/>
+              </w:rPr>
+            </w:pPr>
+            <w:r>
+              <w:rPr>
+                <w:rStyle w:val="5"/>
+                <w:rFonts w:hint="default" w:ascii="sans-serif" w:hAnsi="sans-serif" w:eastAsia="sans-serif" w:cs="sans-serif"/>
+                <w:kern w:val="0"/>
+                <w:sz w:val="24"/>
+                <w:szCs w:val="24"/>
+                <w:lang w:val="en-US" w:eastAsia="zh-CN" w:bidi="ar"/>
+              </w:rPr>
+              <w:t>Service</w:t>
+            </w:r>
+          </w:p>
+        </w:tc>
+        <w:tc>
+          <w:tcPr>
+            <w:tcW w:w="0" w:type="auto"/>
+            <w:tcBorders>
+              <w:top w:val="single" w:color="C4C7C5" w:sz="4" w:space="0"/>
+              <w:left w:val="single" w:color="C4C7C5" w:sz="4" w:space="0"/>
+              <w:bottom w:val="single" w:color="C4C7C5" w:sz="4" w:space="0"/>
+              <w:right w:val="single" w:color="C4C7C5" w:sz="4" w:space="0"/>
+            </w:tcBorders>
+            <w:shd w:val="clear" w:color="auto" w:fill="auto"/>
+            <w:tcMar>
+              <w:top w:w="96" w:type="dxa"/>
+              <w:left w:w="144" w:type="dxa"/>
+              <w:bottom w:w="96" w:type="dxa"/>
+              <w:right w:w="144" w:type="dxa"/>
+            </w:tcMar>
+            <w:vAlign w:val="center"/>
+          </w:tcPr>
+          <w:p>
+            <w:pPr>
+              <w:keepNext w:val="0"/>
+              <w:keepLines w:val="0"/>
+              <w:widowControl/>
+              <w:suppressLineNumbers w:val="0"/>
+              <w:spacing w:before="0" w:beforeAutospacing="0" w:line="12" w:lineRule="atLeast"/>
+              <w:jc w:val="left"/>
+              <w:rPr>
+                <w:rFonts w:hint="default" w:ascii="sans-serif" w:hAnsi="sans-serif" w:eastAsia="sans-serif" w:cs="sans-serif"/>
+              </w:rPr>
+            </w:pPr>
+            <w:r>
+              <w:rPr>
+                <w:rStyle w:val="5"/>
+                <w:rFonts w:hint="default" w:ascii="sans-serif" w:hAnsi="sans-serif" w:eastAsia="sans-serif" w:cs="sans-serif"/>
+                <w:kern w:val="0"/>
+                <w:sz w:val="24"/>
+                <w:szCs w:val="24"/>
+                <w:lang w:val="en-US" w:eastAsia="zh-CN" w:bidi="ar"/>
+              </w:rPr>
+              <w:t>Đường dẫn / Port</w:t>
+            </w:r>
+          </w:p>
+        </w:tc>
+        <w:tc>
+          <w:tcPr>
+            <w:tcW w:w="0" w:type="auto"/>
+            <w:tcBorders>
+              <w:top w:val="single" w:color="C4C7C5" w:sz="4" w:space="0"/>
+              <w:left w:val="single" w:color="C4C7C5" w:sz="4" w:space="0"/>
+              <w:bottom w:val="single" w:color="C4C7C5" w:sz="4" w:space="0"/>
+              <w:right w:val="single" w:color="C4C7C5" w:sz="4" w:space="0"/>
+            </w:tcBorders>
+            <w:shd w:val="clear" w:color="auto" w:fill="auto"/>
+            <w:tcMar>
+              <w:top w:w="96" w:type="dxa"/>
+              <w:left w:w="144" w:type="dxa"/>
+              <w:bottom w:w="96" w:type="dxa"/>
+              <w:right w:w="144" w:type="dxa"/>
+            </w:tcMar>
+            <w:vAlign w:val="center"/>
+          </w:tcPr>
+          <w:p>
+            <w:pPr>
+              <w:keepNext w:val="0"/>
+              <w:keepLines w:val="0"/>
+              <w:widowControl/>
+              <w:suppressLineNumbers w:val="0"/>
+              <w:spacing w:before="0" w:beforeAutospacing="0" w:line="12" w:lineRule="atLeast"/>
+              <w:jc w:val="left"/>
+              <w:rPr>
+                <w:rFonts w:hint="default" w:ascii="sans-serif" w:hAnsi="sans-serif" w:eastAsia="sans-serif" w:cs="sans-serif"/>
+              </w:rPr>
+            </w:pPr>
+            <w:r>
+              <w:rPr>
+                <w:rStyle w:val="5"/>
+                <w:rFonts w:hint="default" w:ascii="sans-serif" w:hAnsi="sans-serif" w:eastAsia="sans-serif" w:cs="sans-serif"/>
+                <w:kern w:val="0"/>
+                <w:sz w:val="24"/>
+                <w:szCs w:val="24"/>
+                <w:lang w:val="en-US" w:eastAsia="zh-CN" w:bidi="ar"/>
+              </w:rPr>
+              <w:t>Vai trò</w:t>
+            </w:r>
+          </w:p>
+        </w:tc>
+      </w:tr>
+      <w:tr>
+        <w:tblPrEx>
+          <w:tblBorders>
+            <w:top w:val="none" w:color="auto" w:sz="0" w:space="0"/>
+            <w:left w:val="none" w:color="auto" w:sz="0" w:space="0"/>
+            <w:bottom w:val="none" w:color="auto" w:sz="0" w:space="0"/>
+            <w:right w:val="none" w:color="auto" w:sz="0" w:space="0"/>
+            <w:insideH w:val="none" w:color="auto" w:sz="0" w:space="0"/>
+            <w:insideV w:val="none" w:color="auto" w:sz="0" w:space="0"/>
+          </w:tblBorders>
+          <w:shd w:val="clear" w:color="auto" w:fill="auto"/>
+          <w:tblCellMar>
+            <w:top w:w="15" w:type="dxa"/>
+            <w:left w:w="15" w:type="dxa"/>
+            <w:bottom w:w="15" w:type="dxa"/>
+            <w:right w:w="15" w:type="dxa"/>
+          </w:tblCellMar>
+        </w:tblPrEx>
+        <w:trPr>
+          <w:tblCellSpacing w:w="15" w:type="dxa"/>
+        </w:trPr>
+        <w:tc>
+          <w:tcPr>
+            <w:tcW w:w="0" w:type="auto"/>
+            <w:tcBorders>
+              <w:top w:val="single" w:color="C4C7C5" w:sz="4" w:space="0"/>
+              <w:left w:val="single" w:color="C4C7C5" w:sz="4" w:space="0"/>
+              <w:bottom w:val="single" w:color="C4C7C5" w:sz="4" w:space="0"/>
+              <w:right w:val="single" w:color="C4C7C5" w:sz="4" w:space="0"/>
+            </w:tcBorders>
+            <w:shd w:val="clear" w:color="auto" w:fill="auto"/>
+            <w:tcMar>
+              <w:top w:w="96" w:type="dxa"/>
+              <w:left w:w="144" w:type="dxa"/>
+              <w:bottom w:w="96" w:type="dxa"/>
+              <w:right w:w="144" w:type="dxa"/>
+            </w:tcMar>
+            <w:vAlign w:val="center"/>
+          </w:tcPr>
+          <w:p>
+            <w:pPr>
+              <w:keepNext w:val="0"/>
+              <w:keepLines w:val="0"/>
+              <w:widowControl/>
+              <w:suppressLineNumbers w:val="0"/>
+              <w:spacing w:before="0" w:beforeAutospacing="0" w:line="12" w:lineRule="atLeast"/>
+              <w:jc w:val="left"/>
+              <w:rPr>
+                <w:rFonts w:hint="default" w:ascii="sans-serif" w:hAnsi="sans-serif" w:eastAsia="sans-serif" w:cs="sans-serif"/>
+              </w:rPr>
+            </w:pPr>
+            <w:r>
+              <w:rPr>
+                <w:rStyle w:val="4"/>
+                <w:rFonts w:hint="default" w:ascii="sans-serif" w:hAnsi="sans-serif" w:eastAsia="sans-serif" w:cs="sans-serif"/>
+                <w:b/>
+                <w:bCs/>
+                <w:kern w:val="0"/>
+                <w:sz w:val="24"/>
+                <w:szCs w:val="24"/>
+                <w:lang w:val="en-US" w:eastAsia="zh-CN" w:bidi="ar"/>
+              </w:rPr>
+              <w:t>api-gateway</w:t>
+            </w:r>
+          </w:p>
+        </w:tc>
+        <w:tc>
+          <w:tcPr>
+            <w:tcW w:w="0" w:type="auto"/>
+            <w:tcBorders>
+              <w:top w:val="single" w:color="C4C7C5" w:sz="4" w:space="0"/>
+              <w:left w:val="single" w:color="C4C7C5" w:sz="4" w:space="0"/>
+              <w:bottom w:val="single" w:color="C4C7C5" w:sz="4" w:space="0"/>
+              <w:right w:val="single" w:color="C4C7C5" w:sz="4" w:space="0"/>
+            </w:tcBorders>
+            <w:shd w:val="clear" w:color="auto" w:fill="auto"/>
+            <w:tcMar>
+              <w:top w:w="96" w:type="dxa"/>
+              <w:left w:w="144" w:type="dxa"/>
+              <w:bottom w:w="96" w:type="dxa"/>
+              <w:right w:w="144" w:type="dxa"/>
+            </w:tcMar>
+            <w:vAlign w:val="center"/>
+          </w:tcPr>
+          <w:p>
+            <w:pPr>
+              <w:keepNext w:val="0"/>
+              <w:keepLines w:val="0"/>
+              <w:widowControl/>
+              <w:suppressLineNumbers w:val="0"/>
+              <w:spacing w:before="0" w:beforeAutospacing="0" w:line="12" w:lineRule="atLeast"/>
+              <w:jc w:val="left"/>
+              <w:rPr>
+                <w:rFonts w:hint="default" w:ascii="sans-serif" w:hAnsi="sans-serif" w:eastAsia="sans-serif" w:cs="sans-serif"/>
+              </w:rPr>
+            </w:pPr>
+            <w:r>
+              <w:rPr>
+                <w:rStyle w:val="4"/>
+                <w:rFonts w:hint="default" w:ascii="sans-serif" w:hAnsi="sans-serif" w:eastAsia="sans-serif" w:cs="sans-serif"/>
+                <w:kern w:val="0"/>
+                <w:sz w:val="24"/>
+                <w:szCs w:val="24"/>
+                <w:lang w:val="en-US" w:eastAsia="zh-CN" w:bidi="ar"/>
+              </w:rPr>
+              <w:t>[http://127.0.0.1:8000](http://127.0.0.1:8000)</w:t>
+            </w:r>
+          </w:p>
+        </w:tc>
+        <w:tc>
+          <w:tcPr>
+            <w:tcW w:w="0" w:type="auto"/>
+            <w:tcBorders>
+              <w:top w:val="single" w:color="C4C7C5" w:sz="4" w:space="0"/>
+              <w:left w:val="single" w:color="C4C7C5" w:sz="4" w:space="0"/>
+              <w:bottom w:val="single" w:color="C4C7C5" w:sz="4" w:space="0"/>
+              <w:right w:val="single" w:color="C4C7C5" w:sz="4" w:space="0"/>
+            </w:tcBorders>
+            <w:shd w:val="clear" w:color="auto" w:fill="auto"/>
+            <w:tcMar>
+              <w:top w:w="96" w:type="dxa"/>
+              <w:left w:w="144" w:type="dxa"/>
+              <w:bottom w:w="96" w:type="dxa"/>
+              <w:right w:w="144" w:type="dxa"/>
+            </w:tcMar>
+            <w:vAlign w:val="center"/>
+          </w:tcPr>
+          <w:p>
+            <w:pPr>
+              <w:keepNext w:val="0"/>
+              <w:keepLines w:val="0"/>
+              <w:widowControl/>
+              <w:suppressLineNumbers w:val="0"/>
+              <w:spacing w:before="0" w:beforeAutospacing="0" w:line="12" w:lineRule="atLeast"/>
+              <w:jc w:val="left"/>
+              <w:rPr>
+                <w:rFonts w:hint="default" w:ascii="sans-serif" w:hAnsi="sans-serif" w:eastAsia="sans-serif" w:cs="sans-serif"/>
+              </w:rPr>
+            </w:pPr>
+            <w:r>
+              <w:rPr>
+                <w:rFonts w:hint="default" w:ascii="sans-serif" w:hAnsi="sans-serif" w:eastAsia="sans-serif" w:cs="sans-serif"/>
+                <w:kern w:val="0"/>
+                <w:sz w:val="24"/>
+                <w:szCs w:val="24"/>
+                <w:lang w:val="en-US" w:eastAsia="zh-CN" w:bidi="ar"/>
+              </w:rPr>
+              <w:t>Cổng tập trung nhận request từ Frontend</w:t>
+            </w:r>
+          </w:p>
+        </w:tc>
+      </w:tr>
+      <w:tr>
+        <w:tblPrEx>
+          <w:tblBorders>
+            <w:top w:val="none" w:color="auto" w:sz="0" w:space="0"/>
+            <w:left w:val="none" w:color="auto" w:sz="0" w:space="0"/>
+            <w:bottom w:val="none" w:color="auto" w:sz="0" w:space="0"/>
+            <w:right w:val="none" w:color="auto" w:sz="0" w:space="0"/>
+            <w:insideH w:val="none" w:color="auto" w:sz="0" w:space="0"/>
+            <w:insideV w:val="none" w:color="auto" w:sz="0" w:space="0"/>
+          </w:tblBorders>
+          <w:shd w:val="clear" w:color="auto" w:fill="auto"/>
+          <w:tblCellMar>
+            <w:top w:w="15" w:type="dxa"/>
+            <w:left w:w="15" w:type="dxa"/>
+            <w:bottom w:w="15" w:type="dxa"/>
+            <w:right w:w="15" w:type="dxa"/>
+          </w:tblCellMar>
+        </w:tblPrEx>
+        <w:trPr>
+          <w:tblCellSpacing w:w="15" w:type="dxa"/>
+        </w:trPr>
+        <w:tc>
+          <w:tcPr>
+            <w:tcW w:w="0" w:type="auto"/>
+            <w:tcBorders>
+              <w:top w:val="single" w:color="C4C7C5" w:sz="4" w:space="0"/>
+              <w:left w:val="single" w:color="C4C7C5" w:sz="4" w:space="0"/>
+              <w:bottom w:val="single" w:color="C4C7C5" w:sz="4" w:space="0"/>
+              <w:right w:val="single" w:color="C4C7C5" w:sz="4" w:space="0"/>
+            </w:tcBorders>
+            <w:shd w:val="clear" w:color="auto" w:fill="auto"/>
+            <w:tcMar>
+              <w:top w:w="96" w:type="dxa"/>
+              <w:left w:w="144" w:type="dxa"/>
+              <w:bottom w:w="96" w:type="dxa"/>
+              <w:right w:w="144" w:type="dxa"/>
+            </w:tcMar>
+            <w:vAlign w:val="center"/>
+          </w:tcPr>
+          <w:p>
+            <w:pPr>
+              <w:keepNext w:val="0"/>
+              <w:keepLines w:val="0"/>
+              <w:widowControl/>
+              <w:suppressLineNumbers w:val="0"/>
+              <w:spacing w:before="0" w:beforeAutospacing="0" w:line="12" w:lineRule="atLeast"/>
+              <w:jc w:val="left"/>
+              <w:rPr>
+                <w:rFonts w:hint="default" w:ascii="sans-serif" w:hAnsi="sans-serif" w:eastAsia="sans-serif" w:cs="sans-serif"/>
+              </w:rPr>
+            </w:pPr>
+            <w:r>
+              <w:rPr>
+                <w:rStyle w:val="4"/>
+                <w:rFonts w:hint="default" w:ascii="sans-serif" w:hAnsi="sans-serif" w:eastAsia="sans-serif" w:cs="sans-serif"/>
+                <w:b/>
+                <w:bCs/>
+                <w:kern w:val="0"/>
+                <w:sz w:val="24"/>
+                <w:szCs w:val="24"/>
+                <w:lang w:val="en-US" w:eastAsia="zh-CN" w:bidi="ar"/>
+              </w:rPr>
+              <w:t>auth-service</w:t>
+            </w:r>
+          </w:p>
+        </w:tc>
+        <w:tc>
+          <w:tcPr>
+            <w:tcW w:w="0" w:type="auto"/>
+            <w:tcBorders>
+              <w:top w:val="single" w:color="C4C7C5" w:sz="4" w:space="0"/>
+              <w:left w:val="single" w:color="C4C7C5" w:sz="4" w:space="0"/>
+              <w:bottom w:val="single" w:color="C4C7C5" w:sz="4" w:space="0"/>
+              <w:right w:val="single" w:color="C4C7C5" w:sz="4" w:space="0"/>
+            </w:tcBorders>
+            <w:shd w:val="clear" w:color="auto" w:fill="auto"/>
+            <w:tcMar>
+              <w:top w:w="96" w:type="dxa"/>
+              <w:left w:w="144" w:type="dxa"/>
+              <w:bottom w:w="96" w:type="dxa"/>
+              <w:right w:w="144" w:type="dxa"/>
+            </w:tcMar>
+            <w:vAlign w:val="center"/>
+          </w:tcPr>
+          <w:p>
+            <w:pPr>
+              <w:keepNext w:val="0"/>
+              <w:keepLines w:val="0"/>
+              <w:widowControl/>
+              <w:suppressLineNumbers w:val="0"/>
+              <w:spacing w:before="0" w:beforeAutospacing="0" w:line="12" w:lineRule="atLeast"/>
+              <w:jc w:val="left"/>
+              <w:rPr>
+                <w:rFonts w:hint="default" w:ascii="sans-serif" w:hAnsi="sans-serif" w:eastAsia="sans-serif" w:cs="sans-serif"/>
+              </w:rPr>
+            </w:pPr>
+            <w:r>
+              <w:rPr>
+                <w:rStyle w:val="4"/>
+                <w:rFonts w:hint="default" w:ascii="sans-serif" w:hAnsi="sans-serif" w:eastAsia="sans-serif" w:cs="sans-serif"/>
+                <w:kern w:val="0"/>
+                <w:sz w:val="24"/>
+                <w:szCs w:val="24"/>
+                <w:lang w:val="en-US" w:eastAsia="zh-CN" w:bidi="ar"/>
+              </w:rPr>
+              <w:t>[http://127.0.0.1:8001](http://127.0.0.1:8001)</w:t>
+            </w:r>
+          </w:p>
+        </w:tc>
+        <w:tc>
+          <w:tcPr>
+            <w:tcW w:w="0" w:type="auto"/>
+            <w:tcBorders>
+              <w:top w:val="single" w:color="C4C7C5" w:sz="4" w:space="0"/>
+              <w:left w:val="single" w:color="C4C7C5" w:sz="4" w:space="0"/>
+              <w:bottom w:val="single" w:color="C4C7C5" w:sz="4" w:space="0"/>
+              <w:right w:val="single" w:color="C4C7C5" w:sz="4" w:space="0"/>
+            </w:tcBorders>
+            <w:shd w:val="clear" w:color="auto" w:fill="auto"/>
+            <w:tcMar>
+              <w:top w:w="96" w:type="dxa"/>
+              <w:left w:w="144" w:type="dxa"/>
+              <w:bottom w:w="96" w:type="dxa"/>
+              <w:right w:w="144" w:type="dxa"/>
+            </w:tcMar>
+            <w:vAlign w:val="center"/>
+          </w:tcPr>
+          <w:p>
+            <w:pPr>
+              <w:keepNext w:val="0"/>
+              <w:keepLines w:val="0"/>
+              <w:widowControl/>
+              <w:suppressLineNumbers w:val="0"/>
+              <w:spacing w:before="0" w:beforeAutospacing="0" w:line="12" w:lineRule="atLeast"/>
+              <w:jc w:val="left"/>
+              <w:rPr>
+                <w:rFonts w:hint="default" w:ascii="sans-serif" w:hAnsi="sans-serif" w:eastAsia="sans-serif" w:cs="sans-serif"/>
+              </w:rPr>
+            </w:pPr>
+            <w:r>
+              <w:rPr>
+                <w:rFonts w:hint="default" w:ascii="sans-serif" w:hAnsi="sans-serif" w:eastAsia="sans-serif" w:cs="sans-serif"/>
+                <w:kern w:val="0"/>
+                <w:sz w:val="24"/>
+                <w:szCs w:val="24"/>
+                <w:lang w:val="en-US" w:eastAsia="zh-CN" w:bidi="ar"/>
+              </w:rPr>
+              <w:t>Quản lý Tài khoản &amp; JWT</w:t>
+            </w:r>
+          </w:p>
+        </w:tc>
+      </w:tr>
+      <w:tr>
+        <w:tblPrEx>
+          <w:tblBorders>
+            <w:top w:val="none" w:color="auto" w:sz="0" w:space="0"/>
+            <w:left w:val="none" w:color="auto" w:sz="0" w:space="0"/>
+            <w:bottom w:val="none" w:color="auto" w:sz="0" w:space="0"/>
+            <w:right w:val="none" w:color="auto" w:sz="0" w:space="0"/>
+            <w:insideH w:val="none" w:color="auto" w:sz="0" w:space="0"/>
+            <w:insideV w:val="none" w:color="auto" w:sz="0" w:space="0"/>
+          </w:tblBorders>
+          <w:tblCellMar>
+            <w:top w:w="15" w:type="dxa"/>
+            <w:left w:w="15" w:type="dxa"/>
+            <w:bottom w:w="15" w:type="dxa"/>
+            <w:right w:w="15" w:type="dxa"/>
+          </w:tblCellMar>
+        </w:tblPrEx>
+        <w:trPr>
+          <w:tblCellSpacing w:w="15" w:type="dxa"/>
+        </w:trPr>
+        <w:tc>
+          <w:tcPr>
+            <w:tcW w:w="0" w:type="auto"/>
+            <w:tcBorders>
+              <w:top w:val="single" w:color="C4C7C5" w:sz="4" w:space="0"/>
+              <w:left w:val="single" w:color="C4C7C5" w:sz="4" w:space="0"/>
+              <w:bottom w:val="single" w:color="C4C7C5" w:sz="4" w:space="0"/>
+              <w:right w:val="single" w:color="C4C7C5" w:sz="4" w:space="0"/>
+            </w:tcBorders>
+            <w:shd w:val="clear" w:color="auto" w:fill="auto"/>
+            <w:tcMar>
+              <w:top w:w="96" w:type="dxa"/>
+              <w:left w:w="144" w:type="dxa"/>
+              <w:bottom w:w="96" w:type="dxa"/>
+              <w:right w:w="144" w:type="dxa"/>
+            </w:tcMar>
+            <w:vAlign w:val="center"/>
+          </w:tcPr>
+          <w:p>
+            <w:pPr>
+              <w:keepNext w:val="0"/>
+              <w:keepLines w:val="0"/>
+              <w:widowControl/>
+              <w:suppressLineNumbers w:val="0"/>
+              <w:spacing w:before="0" w:beforeAutospacing="0" w:line="12" w:lineRule="atLeast"/>
+              <w:jc w:val="left"/>
+              <w:rPr>
+                <w:rFonts w:hint="default" w:ascii="sans-serif" w:hAnsi="sans-serif" w:eastAsia="sans-serif" w:cs="sans-serif"/>
+              </w:rPr>
+            </w:pPr>
+            <w:r>
+              <w:rPr>
+                <w:rStyle w:val="4"/>
+                <w:rFonts w:hint="default" w:ascii="sans-serif" w:hAnsi="sans-serif" w:eastAsia="sans-serif" w:cs="sans-serif"/>
+                <w:b/>
+                <w:bCs/>
+                <w:kern w:val="0"/>
+                <w:sz w:val="24"/>
+                <w:szCs w:val="24"/>
+                <w:lang w:val="en-US" w:eastAsia="zh-CN" w:bidi="ar"/>
+              </w:rPr>
+              <w:t>catalog-service</w:t>
+            </w:r>
+          </w:p>
+        </w:tc>
+        <w:tc>
+          <w:tcPr>
+            <w:tcW w:w="0" w:type="auto"/>
+            <w:tcBorders>
+              <w:top w:val="single" w:color="C4C7C5" w:sz="4" w:space="0"/>
+              <w:left w:val="single" w:color="C4C7C5" w:sz="4" w:space="0"/>
+              <w:bottom w:val="single" w:color="C4C7C5" w:sz="4" w:space="0"/>
+              <w:right w:val="single" w:color="C4C7C5" w:sz="4" w:space="0"/>
+            </w:tcBorders>
+            <w:shd w:val="clear" w:color="auto" w:fill="auto"/>
+            <w:tcMar>
+              <w:top w:w="96" w:type="dxa"/>
+              <w:left w:w="144" w:type="dxa"/>
+              <w:bottom w:w="96" w:type="dxa"/>
+              <w:right w:w="144" w:type="dxa"/>
+            </w:tcMar>
+            <w:vAlign w:val="center"/>
+          </w:tcPr>
+          <w:p>
+            <w:pPr>
+              <w:keepNext w:val="0"/>
+              <w:keepLines w:val="0"/>
+              <w:widowControl/>
+              <w:suppressLineNumbers w:val="0"/>
+              <w:spacing w:before="0" w:beforeAutospacing="0" w:line="12" w:lineRule="atLeast"/>
+              <w:jc w:val="left"/>
+              <w:rPr>
+                <w:rFonts w:hint="default" w:ascii="sans-serif" w:hAnsi="sans-serif" w:eastAsia="sans-serif" w:cs="sans-serif"/>
+              </w:rPr>
+            </w:pPr>
+            <w:r>
+              <w:rPr>
+                <w:rStyle w:val="4"/>
+                <w:rFonts w:hint="default" w:ascii="sans-serif" w:hAnsi="sans-serif" w:eastAsia="sans-serif" w:cs="sans-serif"/>
+                <w:kern w:val="0"/>
+                <w:sz w:val="24"/>
+                <w:szCs w:val="24"/>
+                <w:lang w:val="en-US" w:eastAsia="zh-CN" w:bidi="ar"/>
+              </w:rPr>
+              <w:t>[http://127.0.0.1:8002](http://127.0.0.1:8002)</w:t>
+            </w:r>
+          </w:p>
+        </w:tc>
+        <w:tc>
+          <w:tcPr>
+            <w:tcW w:w="0" w:type="auto"/>
+            <w:tcBorders>
+              <w:top w:val="single" w:color="C4C7C5" w:sz="4" w:space="0"/>
+              <w:left w:val="single" w:color="C4C7C5" w:sz="4" w:space="0"/>
+              <w:bottom w:val="single" w:color="C4C7C5" w:sz="4" w:space="0"/>
+              <w:right w:val="single" w:color="C4C7C5" w:sz="4" w:space="0"/>
+            </w:tcBorders>
+            <w:shd w:val="clear" w:color="auto" w:fill="auto"/>
+            <w:tcMar>
+              <w:top w:w="96" w:type="dxa"/>
+              <w:left w:w="144" w:type="dxa"/>
+              <w:bottom w:w="96" w:type="dxa"/>
+              <w:right w:w="144" w:type="dxa"/>
+            </w:tcMar>
+            <w:vAlign w:val="center"/>
+          </w:tcPr>
+          <w:p>
+            <w:pPr>
+              <w:keepNext w:val="0"/>
+              <w:keepLines w:val="0"/>
+              <w:widowControl/>
+              <w:suppressLineNumbers w:val="0"/>
+              <w:spacing w:before="0" w:beforeAutospacing="0" w:line="12" w:lineRule="atLeast"/>
+              <w:jc w:val="left"/>
+              <w:rPr>
+                <w:rFonts w:hint="default" w:ascii="sans-serif" w:hAnsi="sans-serif" w:eastAsia="sans-serif" w:cs="sans-serif"/>
+              </w:rPr>
+            </w:pPr>
+            <w:r>
+              <w:rPr>
+                <w:rFonts w:hint="default" w:ascii="sans-serif" w:hAnsi="sans-serif" w:eastAsia="sans-serif" w:cs="sans-serif"/>
+                <w:kern w:val="0"/>
+                <w:sz w:val="24"/>
+                <w:szCs w:val="24"/>
+                <w:lang w:val="en-US" w:eastAsia="zh-CN" w:bidi="ar"/>
+              </w:rPr>
+              <w:t>Quản lý Danh mục &amp; Sản phẩm</w:t>
+            </w:r>
+          </w:p>
+        </w:tc>
+      </w:tr>
+      <w:tr>
+        <w:tblPrEx>
+          <w:tblBorders>
+            <w:top w:val="none" w:color="auto" w:sz="0" w:space="0"/>
+            <w:left w:val="none" w:color="auto" w:sz="0" w:space="0"/>
+            <w:bottom w:val="none" w:color="auto" w:sz="0" w:space="0"/>
+            <w:right w:val="none" w:color="auto" w:sz="0" w:space="0"/>
+            <w:insideH w:val="none" w:color="auto" w:sz="0" w:space="0"/>
+            <w:insideV w:val="none" w:color="auto" w:sz="0" w:space="0"/>
+          </w:tblBorders>
+          <w:shd w:val="clear" w:color="auto" w:fill="auto"/>
+          <w:tblCellMar>
+            <w:top w:w="15" w:type="dxa"/>
+            <w:left w:w="15" w:type="dxa"/>
+            <w:bottom w:w="15" w:type="dxa"/>
+            <w:right w:w="15" w:type="dxa"/>
+          </w:tblCellMar>
+        </w:tblPrEx>
+        <w:trPr>
+          <w:tblCellSpacing w:w="15" w:type="dxa"/>
+        </w:trPr>
+        <w:tc>
+          <w:tcPr>
+            <w:tcW w:w="0" w:type="auto"/>
+            <w:tcBorders>
+              <w:top w:val="single" w:color="C4C7C5" w:sz="4" w:space="0"/>
+              <w:left w:val="single" w:color="C4C7C5" w:sz="4" w:space="0"/>
+              <w:bottom w:val="single" w:color="C4C7C5" w:sz="4" w:space="0"/>
+              <w:right w:val="single" w:color="C4C7C5" w:sz="4" w:space="0"/>
+            </w:tcBorders>
+            <w:shd w:val="clear" w:color="auto" w:fill="auto"/>
+            <w:tcMar>
+              <w:top w:w="96" w:type="dxa"/>
+              <w:left w:w="144" w:type="dxa"/>
+              <w:bottom w:w="96" w:type="dxa"/>
+              <w:right w:w="144" w:type="dxa"/>
+            </w:tcMar>
+            <w:vAlign w:val="center"/>
+          </w:tcPr>
+          <w:p>
+            <w:pPr>
+              <w:keepNext w:val="0"/>
+              <w:keepLines w:val="0"/>
+              <w:widowControl/>
+              <w:suppressLineNumbers w:val="0"/>
+              <w:spacing w:before="0" w:beforeAutospacing="0" w:line="12" w:lineRule="atLeast"/>
+              <w:jc w:val="left"/>
+              <w:rPr>
+                <w:rFonts w:hint="default" w:ascii="sans-serif" w:hAnsi="sans-serif" w:eastAsia="sans-serif" w:cs="sans-serif"/>
+              </w:rPr>
+            </w:pPr>
+            <w:r>
+              <w:rPr>
+                <w:rStyle w:val="4"/>
+                <w:rFonts w:hint="default" w:ascii="sans-serif" w:hAnsi="sans-serif" w:eastAsia="sans-serif" w:cs="sans-serif"/>
+                <w:b/>
+                <w:bCs/>
+                <w:kern w:val="0"/>
+                <w:sz w:val="24"/>
+                <w:szCs w:val="24"/>
+                <w:lang w:val="en-US" w:eastAsia="zh-CN" w:bidi="ar"/>
+              </w:rPr>
+              <w:t>order-service</w:t>
+            </w:r>
+          </w:p>
+        </w:tc>
+        <w:tc>
+          <w:tcPr>
+            <w:tcW w:w="0" w:type="auto"/>
+            <w:tcBorders>
+              <w:top w:val="single" w:color="C4C7C5" w:sz="4" w:space="0"/>
+              <w:left w:val="single" w:color="C4C7C5" w:sz="4" w:space="0"/>
+              <w:bottom w:val="single" w:color="C4C7C5" w:sz="4" w:space="0"/>
+              <w:right w:val="single" w:color="C4C7C5" w:sz="4" w:space="0"/>
+            </w:tcBorders>
+            <w:shd w:val="clear" w:color="auto" w:fill="auto"/>
+            <w:tcMar>
+              <w:top w:w="96" w:type="dxa"/>
+              <w:left w:w="144" w:type="dxa"/>
+              <w:bottom w:w="96" w:type="dxa"/>
+              <w:right w:w="144" w:type="dxa"/>
+            </w:tcMar>
+            <w:vAlign w:val="center"/>
+          </w:tcPr>
+          <w:p>
+            <w:pPr>
+              <w:keepNext w:val="0"/>
+              <w:keepLines w:val="0"/>
+              <w:widowControl/>
+              <w:suppressLineNumbers w:val="0"/>
+              <w:spacing w:before="0" w:beforeAutospacing="0" w:line="12" w:lineRule="atLeast"/>
+              <w:jc w:val="left"/>
+              <w:rPr>
+                <w:rFonts w:hint="default" w:ascii="sans-serif" w:hAnsi="sans-serif" w:eastAsia="sans-serif" w:cs="sans-serif"/>
+              </w:rPr>
+            </w:pPr>
+            <w:r>
+              <w:rPr>
+                <w:rStyle w:val="4"/>
+                <w:rFonts w:hint="default" w:ascii="sans-serif" w:hAnsi="sans-serif" w:eastAsia="sans-serif" w:cs="sans-serif"/>
+                <w:kern w:val="0"/>
+                <w:sz w:val="24"/>
+                <w:szCs w:val="24"/>
+                <w:lang w:val="en-US" w:eastAsia="zh-CN" w:bidi="ar"/>
+              </w:rPr>
+              <w:t>[http://127.0.0.1:8003](http://127.0.0.1:8003)</w:t>
+            </w:r>
+          </w:p>
+        </w:tc>
+        <w:tc>
+          <w:tcPr>
+            <w:tcW w:w="0" w:type="auto"/>
+            <w:tcBorders>
+              <w:top w:val="single" w:color="C4C7C5" w:sz="4" w:space="0"/>
+              <w:left w:val="single" w:color="C4C7C5" w:sz="4" w:space="0"/>
+              <w:bottom w:val="single" w:color="C4C7C5" w:sz="4" w:space="0"/>
+              <w:right w:val="single" w:color="C4C7C5" w:sz="4" w:space="0"/>
+            </w:tcBorders>
+            <w:shd w:val="clear" w:color="auto" w:fill="auto"/>
+            <w:tcMar>
+              <w:top w:w="96" w:type="dxa"/>
+              <w:left w:w="144" w:type="dxa"/>
+              <w:bottom w:w="96" w:type="dxa"/>
+              <w:right w:w="144" w:type="dxa"/>
+            </w:tcMar>
+            <w:vAlign w:val="center"/>
+          </w:tcPr>
+          <w:p>
+            <w:pPr>
+              <w:keepNext w:val="0"/>
+              <w:keepLines w:val="0"/>
+              <w:widowControl/>
+              <w:suppressLineNumbers w:val="0"/>
+              <w:spacing w:before="0" w:beforeAutospacing="0" w:line="12" w:lineRule="atLeast"/>
+              <w:jc w:val="left"/>
+              <w:rPr>
+                <w:rFonts w:hint="default" w:ascii="sans-serif" w:hAnsi="sans-serif" w:eastAsia="sans-serif" w:cs="sans-serif"/>
+              </w:rPr>
+            </w:pPr>
+            <w:r>
+              <w:rPr>
+                <w:rFonts w:hint="default" w:ascii="sans-serif" w:hAnsi="sans-serif" w:eastAsia="sans-serif" w:cs="sans-serif"/>
+                <w:kern w:val="0"/>
+                <w:sz w:val="24"/>
+                <w:szCs w:val="24"/>
+                <w:lang w:val="en-US" w:eastAsia="zh-CN" w:bidi="ar"/>
+              </w:rPr>
+              <w:t>Quản lý Giỏ hàng &amp; Đơn hàng</w:t>
+            </w:r>
+          </w:p>
+        </w:tc>
+      </w:tr>
+      <w:tr>
+        <w:tblPrEx>
+          <w:tblBorders>
+            <w:top w:val="none" w:color="auto" w:sz="0" w:space="0"/>
+            <w:left w:val="none" w:color="auto" w:sz="0" w:space="0"/>
+            <w:bottom w:val="none" w:color="auto" w:sz="0" w:space="0"/>
+            <w:right w:val="none" w:color="auto" w:sz="0" w:space="0"/>
+            <w:insideH w:val="none" w:color="auto" w:sz="0" w:space="0"/>
+            <w:insideV w:val="none" w:color="auto" w:sz="0" w:space="0"/>
+          </w:tblBorders>
+          <w:shd w:val="clear" w:color="auto" w:fill="auto"/>
+          <w:tblCellMar>
+            <w:top w:w="15" w:type="dxa"/>
+            <w:left w:w="15" w:type="dxa"/>
+            <w:bottom w:w="15" w:type="dxa"/>
+            <w:right w:w="15" w:type="dxa"/>
+          </w:tblCellMar>
+        </w:tblPrEx>
+        <w:trPr>
+          <w:tblCellSpacing w:w="15" w:type="dxa"/>
+        </w:trPr>
+        <w:tc>
+          <w:tcPr>
+            <w:tcW w:w="0" w:type="auto"/>
+            <w:tcBorders>
+              <w:top w:val="single" w:color="C4C7C5" w:sz="4" w:space="0"/>
+              <w:left w:val="single" w:color="C4C7C5" w:sz="4" w:space="0"/>
+              <w:bottom w:val="single" w:color="C4C7C5" w:sz="4" w:space="0"/>
+              <w:right w:val="single" w:color="C4C7C5" w:sz="4" w:space="0"/>
+            </w:tcBorders>
+            <w:shd w:val="clear" w:color="auto" w:fill="auto"/>
+            <w:tcMar>
+              <w:top w:w="96" w:type="dxa"/>
+              <w:left w:w="144" w:type="dxa"/>
+              <w:bottom w:w="96" w:type="dxa"/>
+              <w:right w:w="144" w:type="dxa"/>
+            </w:tcMar>
+            <w:vAlign w:val="center"/>
+          </w:tcPr>
+          <w:p>
+            <w:pPr>
+              <w:keepNext w:val="0"/>
+              <w:keepLines w:val="0"/>
+              <w:widowControl/>
+              <w:suppressLineNumbers w:val="0"/>
+              <w:spacing w:before="0" w:beforeAutospacing="0" w:line="12" w:lineRule="atLeast"/>
+              <w:jc w:val="left"/>
+              <w:rPr>
+                <w:rFonts w:hint="default" w:ascii="sans-serif" w:hAnsi="sans-serif" w:eastAsia="sans-serif" w:cs="sans-serif"/>
+              </w:rPr>
+            </w:pPr>
+            <w:r>
+              <w:rPr>
+                <w:rStyle w:val="4"/>
+                <w:rFonts w:hint="default" w:ascii="sans-serif" w:hAnsi="sans-serif" w:eastAsia="sans-serif" w:cs="sans-serif"/>
+                <w:b/>
+                <w:bCs/>
+                <w:kern w:val="0"/>
+                <w:sz w:val="24"/>
+                <w:szCs w:val="24"/>
+                <w:lang w:val="en-US" w:eastAsia="zh-CN" w:bidi="ar"/>
+              </w:rPr>
+              <w:t>payment-service</w:t>
+            </w:r>
+          </w:p>
+        </w:tc>
+        <w:tc>
+          <w:tcPr>
+            <w:tcW w:w="0" w:type="auto"/>
+            <w:tcBorders>
+              <w:top w:val="single" w:color="C4C7C5" w:sz="4" w:space="0"/>
+              <w:left w:val="single" w:color="C4C7C5" w:sz="4" w:space="0"/>
+              <w:bottom w:val="single" w:color="C4C7C5" w:sz="4" w:space="0"/>
+              <w:right w:val="single" w:color="C4C7C5" w:sz="4" w:space="0"/>
+            </w:tcBorders>
+            <w:shd w:val="clear" w:color="auto" w:fill="auto"/>
+            <w:tcMar>
+              <w:top w:w="96" w:type="dxa"/>
+              <w:left w:w="144" w:type="dxa"/>
+              <w:bottom w:w="96" w:type="dxa"/>
+              <w:right w:w="144" w:type="dxa"/>
+            </w:tcMar>
+            <w:vAlign w:val="center"/>
+          </w:tcPr>
+          <w:p>
+            <w:pPr>
+              <w:keepNext w:val="0"/>
+              <w:keepLines w:val="0"/>
+              <w:widowControl/>
+              <w:suppressLineNumbers w:val="0"/>
+              <w:spacing w:before="0" w:beforeAutospacing="0" w:line="12" w:lineRule="atLeast"/>
+              <w:jc w:val="left"/>
+              <w:rPr>
+                <w:rFonts w:hint="default" w:ascii="sans-serif" w:hAnsi="sans-serif" w:eastAsia="sans-serif" w:cs="sans-serif"/>
+              </w:rPr>
+            </w:pPr>
+            <w:r>
+              <w:rPr>
+                <w:rStyle w:val="4"/>
+                <w:rFonts w:hint="default" w:ascii="sans-serif" w:hAnsi="sans-serif" w:eastAsia="sans-serif" w:cs="sans-serif"/>
+                <w:kern w:val="0"/>
+                <w:sz w:val="24"/>
+                <w:szCs w:val="24"/>
+                <w:lang w:val="en-US" w:eastAsia="zh-CN" w:bidi="ar"/>
+              </w:rPr>
+              <w:t>[http://127.0.0.1:8004](http://127.0.0.1:8004)</w:t>
+            </w:r>
+          </w:p>
+        </w:tc>
+        <w:tc>
+          <w:tcPr>
+            <w:tcW w:w="0" w:type="auto"/>
+            <w:tcBorders>
+              <w:top w:val="single" w:color="C4C7C5" w:sz="4" w:space="0"/>
+              <w:left w:val="single" w:color="C4C7C5" w:sz="4" w:space="0"/>
+              <w:bottom w:val="single" w:color="C4C7C5" w:sz="4" w:space="0"/>
+              <w:right w:val="single" w:color="C4C7C5" w:sz="4" w:space="0"/>
+            </w:tcBorders>
+            <w:shd w:val="clear" w:color="auto" w:fill="auto"/>
+            <w:tcMar>
+              <w:top w:w="96" w:type="dxa"/>
+              <w:left w:w="144" w:type="dxa"/>
+              <w:bottom w:w="96" w:type="dxa"/>
+              <w:right w:w="144" w:type="dxa"/>
+            </w:tcMar>
+            <w:vAlign w:val="center"/>
+          </w:tcPr>
+          <w:p>
+            <w:pPr>
+              <w:keepNext w:val="0"/>
+              <w:keepLines w:val="0"/>
+              <w:widowControl/>
+              <w:suppressLineNumbers w:val="0"/>
+              <w:spacing w:before="0" w:beforeAutospacing="0" w:line="12" w:lineRule="atLeast"/>
+              <w:jc w:val="left"/>
+              <w:rPr>
+                <w:rFonts w:hint="default" w:ascii="sans-serif" w:hAnsi="sans-serif" w:eastAsia="sans-serif" w:cs="sans-serif"/>
+              </w:rPr>
+            </w:pPr>
+            <w:r>
+              <w:rPr>
+                <w:rFonts w:hint="default" w:ascii="sans-serif" w:hAnsi="sans-serif" w:eastAsia="sans-serif" w:cs="sans-serif"/>
+                <w:kern w:val="0"/>
+                <w:sz w:val="24"/>
+                <w:szCs w:val="24"/>
+                <w:lang w:val="en-US" w:eastAsia="zh-CN" w:bidi="ar"/>
+              </w:rPr>
+              <w:t>Quản lý Thanh toán</w:t>
+            </w:r>
+          </w:p>
+        </w:tc>
+      </w:tr>
+    </w:tbl>
+    <w:p>
+      <w:pPr>
+        <w:rPr>
+          <w:rFonts w:hint="default"/>
+          <w:lang w:val="en-US"/>
+        </w:rPr>
+      </w:pPr>
+    </w:p>
+    <w:p>
+      <w:pPr>
+        <w:rPr>
+          <w:rFonts w:hint="default"/>
+          <w:lang w:val="en-US"/>
+        </w:rPr>
+      </w:pPr>
+    </w:p>
+    <w:p>
+      <w:pPr>
+        <w:rPr>
+          <w:rFonts w:hint="default"/>
+          <w:lang w:val="en-US"/>
+        </w:rPr>
+      </w:pPr>
+    </w:p>
+    <w:p>
+      <w:pPr>
+        <w:rPr>
+          <w:rFonts w:hint="default"/>
+          <w:lang w:val="en-US"/>
+        </w:rPr>
+      </w:pPr>
+    </w:p>
+    <w:tbl>
+      <w:tblPr>
+        <w:tblW w:w="0" w:type="auto"/>
+        <w:tblCellSpacing w:w="15" w:type="dxa"/>
+        <w:tblInd w:w="10" w:type="dxa"/>
+        <w:tblBorders>
+          <w:top w:val="none" w:color="auto" w:sz="0" w:space="0"/>
+          <w:left w:val="none" w:color="auto" w:sz="0" w:space="0"/>
+          <w:bottom w:val="none" w:color="auto" w:sz="0" w:space="0"/>
+          <w:right w:val="none" w:color="auto" w:sz="0" w:space="0"/>
+          <w:insideH w:val="none" w:color="auto" w:sz="0" w:space="0"/>
+          <w:insideV w:val="none" w:color="auto" w:sz="0" w:space="0"/>
+        </w:tblBorders>
+        <w:shd w:val="clear"/>
+        <w:tblLayout w:type="fixed"/>
+        <w:tblCellMar>
+          <w:top w:w="15" w:type="dxa"/>
+          <w:left w:w="15" w:type="dxa"/>
+          <w:bottom w:w="15" w:type="dxa"/>
+          <w:right w:w="15" w:type="dxa"/>
+        </w:tblCellMar>
+      </w:tblPr>
+      <w:tblGrid>
+        <w:gridCol w:w="1419"/>
+        <w:gridCol w:w="3683"/>
+        <w:gridCol w:w="3562"/>
+      </w:tblGrid>
+      <w:tr>
+        <w:tblPrEx>
+          <w:tblBorders>
+            <w:top w:val="none" w:color="auto" w:sz="0" w:space="0"/>
+            <w:left w:val="none" w:color="auto" w:sz="0" w:space="0"/>
+            <w:bottom w:val="none" w:color="auto" w:sz="0" w:space="0"/>
+            <w:right w:val="none" w:color="auto" w:sz="0" w:space="0"/>
+            <w:insideH w:val="none" w:color="auto" w:sz="0" w:space="0"/>
+            <w:insideV w:val="none" w:color="auto" w:sz="0" w:space="0"/>
+          </w:tblBorders>
+          <w:shd w:val="clear"/>
+          <w:tblCellMar>
+            <w:top w:w="15" w:type="dxa"/>
+            <w:left w:w="15" w:type="dxa"/>
+            <w:bottom w:w="15" w:type="dxa"/>
+            <w:right w:w="15" w:type="dxa"/>
+          </w:tblCellMar>
+        </w:tblPrEx>
+        <w:trPr>
+          <w:tblHeader/>
+          <w:tblCellSpacing w:w="15" w:type="dxa"/>
+        </w:trPr>
+        <w:tc>
+          <w:tcPr>
+            <w:tcW w:w="1374" w:type="dxa"/>
+            <w:tcBorders>
+              <w:top w:val="single" w:color="C4C7C5" w:sz="4" w:space="0"/>
+              <w:left w:val="single" w:color="C4C7C5" w:sz="4" w:space="0"/>
+              <w:bottom w:val="single" w:color="C4C7C5" w:sz="4" w:space="0"/>
+              <w:right w:val="single" w:color="C4C7C5" w:sz="4" w:space="0"/>
+            </w:tcBorders>
+            <w:shd w:val="clear"/>
+            <w:tcMar>
+              <w:top w:w="96" w:type="dxa"/>
+              <w:left w:w="144" w:type="dxa"/>
+              <w:bottom w:w="96" w:type="dxa"/>
+              <w:right w:w="144" w:type="dxa"/>
+            </w:tcMar>
+            <w:vAlign w:val="center"/>
+          </w:tcPr>
+          <w:p>
+            <w:pPr>
+              <w:keepNext w:val="0"/>
+              <w:keepLines w:val="0"/>
+              <w:widowControl/>
+              <w:suppressLineNumbers w:val="0"/>
+              <w:spacing w:before="0" w:beforeAutospacing="0" w:line="12" w:lineRule="atLeast"/>
+              <w:jc w:val="left"/>
+              <w:rPr>
+                <w:rFonts w:ascii="sans-serif" w:hAnsi="sans-serif" w:eastAsia="sans-serif" w:cs="sans-serif"/>
+              </w:rPr>
+            </w:pPr>
+            <w:r>
+              <w:rPr>
+                <w:rStyle w:val="5"/>
+                <w:rFonts w:hint="default" w:ascii="sans-serif" w:hAnsi="sans-serif" w:eastAsia="sans-serif" w:cs="sans-serif"/>
+                <w:kern w:val="0"/>
+                <w:sz w:val="24"/>
+                <w:szCs w:val="24"/>
+                <w:bdr w:val="none" w:color="auto" w:sz="0" w:space="0"/>
+                <w:lang w:val="en-US" w:eastAsia="zh-CN" w:bidi="ar"/>
+              </w:rPr>
+              <w:t>Service</w:t>
+            </w:r>
+          </w:p>
+        </w:tc>
+        <w:tc>
+          <w:tcPr>
+            <w:tcW w:w="3653" w:type="dxa"/>
+            <w:tcBorders>
+              <w:top w:val="single" w:color="C4C7C5" w:sz="4" w:space="0"/>
+              <w:left w:val="single" w:color="C4C7C5" w:sz="4" w:space="0"/>
+              <w:bottom w:val="single" w:color="C4C7C5" w:sz="4" w:space="0"/>
+              <w:right w:val="single" w:color="C4C7C5" w:sz="4" w:space="0"/>
+            </w:tcBorders>
+            <w:shd w:val="clear"/>
+            <w:tcMar>
+              <w:top w:w="96" w:type="dxa"/>
+              <w:left w:w="144" w:type="dxa"/>
+              <w:bottom w:w="96" w:type="dxa"/>
+              <w:right w:w="144" w:type="dxa"/>
+            </w:tcMar>
+            <w:vAlign w:val="center"/>
+          </w:tcPr>
+          <w:p>
+            <w:pPr>
+              <w:keepNext w:val="0"/>
+              <w:keepLines w:val="0"/>
+              <w:widowControl/>
+              <w:suppressLineNumbers w:val="0"/>
+              <w:spacing w:before="0" w:beforeAutospacing="0" w:line="12" w:lineRule="atLeast"/>
+              <w:jc w:val="left"/>
+              <w:rPr>
+                <w:rFonts w:hint="default" w:ascii="sans-serif" w:hAnsi="sans-serif" w:eastAsia="sans-serif" w:cs="sans-serif"/>
+              </w:rPr>
+            </w:pPr>
+            <w:r>
+              <w:rPr>
+                <w:rStyle w:val="5"/>
+                <w:rFonts w:hint="default" w:ascii="sans-serif" w:hAnsi="sans-serif" w:eastAsia="sans-serif" w:cs="sans-serif"/>
+                <w:kern w:val="0"/>
+                <w:sz w:val="24"/>
+                <w:szCs w:val="24"/>
+                <w:bdr w:val="none" w:color="auto" w:sz="0" w:space="0"/>
+                <w:lang w:val="en-US" w:eastAsia="zh-CN" w:bidi="ar"/>
+              </w:rPr>
+              <w:t>Lệnh Terminal</w:t>
+            </w:r>
+          </w:p>
+        </w:tc>
+        <w:tc>
+          <w:tcPr>
+            <w:tcW w:w="3517" w:type="dxa"/>
+            <w:tcBorders>
+              <w:top w:val="single" w:color="C4C7C5" w:sz="4" w:space="0"/>
+              <w:left w:val="single" w:color="C4C7C5" w:sz="4" w:space="0"/>
+              <w:bottom w:val="single" w:color="C4C7C5" w:sz="4" w:space="0"/>
+              <w:right w:val="single" w:color="C4C7C5" w:sz="4" w:space="0"/>
+            </w:tcBorders>
+            <w:shd w:val="clear"/>
+            <w:tcMar>
+              <w:top w:w="96" w:type="dxa"/>
+              <w:left w:w="144" w:type="dxa"/>
+              <w:bottom w:w="96" w:type="dxa"/>
+              <w:right w:w="144" w:type="dxa"/>
+            </w:tcMar>
+            <w:vAlign w:val="center"/>
+          </w:tcPr>
+          <w:p>
+            <w:pPr>
+              <w:keepNext w:val="0"/>
+              <w:keepLines w:val="0"/>
+              <w:widowControl/>
+              <w:suppressLineNumbers w:val="0"/>
+              <w:spacing w:before="0" w:beforeAutospacing="0" w:line="12" w:lineRule="atLeast"/>
+              <w:jc w:val="left"/>
+              <w:rPr>
+                <w:rFonts w:hint="default" w:ascii="sans-serif" w:hAnsi="sans-serif" w:eastAsia="sans-serif" w:cs="sans-serif"/>
+              </w:rPr>
+            </w:pPr>
+            <w:r>
+              <w:rPr>
+                <w:rStyle w:val="5"/>
+                <w:rFonts w:hint="default" w:ascii="sans-serif" w:hAnsi="sans-serif" w:eastAsia="sans-serif" w:cs="sans-serif"/>
+                <w:kern w:val="0"/>
+                <w:sz w:val="24"/>
+                <w:szCs w:val="24"/>
+                <w:bdr w:val="none" w:color="auto" w:sz="0" w:space="0"/>
+                <w:lang w:val="en-US" w:eastAsia="zh-CN" w:bidi="ar"/>
+              </w:rPr>
+              <w:t>URL / Port</w:t>
+            </w:r>
+          </w:p>
+        </w:tc>
+      </w:tr>
+      <w:tr>
+        <w:tblPrEx>
+          <w:tblBorders>
+            <w:top w:val="none" w:color="auto" w:sz="0" w:space="0"/>
+            <w:left w:val="none" w:color="auto" w:sz="0" w:space="0"/>
+            <w:bottom w:val="none" w:color="auto" w:sz="0" w:space="0"/>
+            <w:right w:val="none" w:color="auto" w:sz="0" w:space="0"/>
+            <w:insideH w:val="none" w:color="auto" w:sz="0" w:space="0"/>
+            <w:insideV w:val="none" w:color="auto" w:sz="0" w:space="0"/>
+          </w:tblBorders>
+          <w:shd w:val="clear"/>
+          <w:tblCellMar>
+            <w:top w:w="15" w:type="dxa"/>
+            <w:left w:w="15" w:type="dxa"/>
+            <w:bottom w:w="15" w:type="dxa"/>
+            <w:right w:w="15" w:type="dxa"/>
+          </w:tblCellMar>
+        </w:tblPrEx>
+        <w:trPr>
+          <w:tblCellSpacing w:w="15" w:type="dxa"/>
+        </w:trPr>
+        <w:tc>
+          <w:tcPr>
+            <w:tcW w:w="1374" w:type="dxa"/>
+            <w:tcBorders>
+              <w:top w:val="single" w:color="C4C7C5" w:sz="4" w:space="0"/>
+              <w:left w:val="single" w:color="C4C7C5" w:sz="4" w:space="0"/>
+              <w:bottom w:val="single" w:color="C4C7C5" w:sz="4" w:space="0"/>
+              <w:right w:val="single" w:color="C4C7C5" w:sz="4" w:space="0"/>
+            </w:tcBorders>
+            <w:shd w:val="clear"/>
+            <w:tcMar>
+              <w:top w:w="96" w:type="dxa"/>
+              <w:left w:w="144" w:type="dxa"/>
+              <w:bottom w:w="96" w:type="dxa"/>
+              <w:right w:w="144" w:type="dxa"/>
+            </w:tcMar>
+            <w:vAlign w:val="center"/>
+          </w:tcPr>
+          <w:p>
+            <w:pPr>
+              <w:keepNext w:val="0"/>
+              <w:keepLines w:val="0"/>
+              <w:widowControl/>
+              <w:suppressLineNumbers w:val="0"/>
+              <w:spacing w:before="0" w:beforeAutospacing="0" w:line="12" w:lineRule="atLeast"/>
+              <w:jc w:val="left"/>
+              <w:rPr>
+                <w:rFonts w:hint="default" w:ascii="sans-serif" w:hAnsi="sans-serif" w:eastAsia="sans-serif" w:cs="sans-serif"/>
+              </w:rPr>
+            </w:pPr>
+            <w:r>
+              <w:rPr>
+                <w:rStyle w:val="4"/>
+                <w:rFonts w:hint="default" w:ascii="sans-serif" w:hAnsi="sans-serif" w:eastAsia="sans-serif" w:cs="sans-serif"/>
+                <w:b/>
+                <w:bCs/>
+                <w:kern w:val="0"/>
+                <w:sz w:val="24"/>
+                <w:szCs w:val="24"/>
+                <w:bdr w:val="none" w:color="auto" w:sz="0" w:space="0"/>
+                <w:lang w:val="en-US" w:eastAsia="zh-CN" w:bidi="ar"/>
+              </w:rPr>
+              <w:t>api-gateway</w:t>
+            </w:r>
+          </w:p>
+        </w:tc>
+        <w:tc>
+          <w:tcPr>
+            <w:tcW w:w="3653" w:type="dxa"/>
+            <w:tcBorders>
+              <w:top w:val="single" w:color="C4C7C5" w:sz="4" w:space="0"/>
+              <w:left w:val="single" w:color="C4C7C5" w:sz="4" w:space="0"/>
+              <w:bottom w:val="single" w:color="C4C7C5" w:sz="4" w:space="0"/>
+              <w:right w:val="single" w:color="C4C7C5" w:sz="4" w:space="0"/>
+            </w:tcBorders>
+            <w:shd w:val="clear"/>
+            <w:tcMar>
+              <w:top w:w="96" w:type="dxa"/>
+              <w:left w:w="144" w:type="dxa"/>
+              <w:bottom w:w="96" w:type="dxa"/>
+              <w:right w:w="144" w:type="dxa"/>
+            </w:tcMar>
+            <w:vAlign w:val="center"/>
+          </w:tcPr>
+          <w:p>
+            <w:pPr>
+              <w:keepNext w:val="0"/>
+              <w:keepLines w:val="0"/>
+              <w:widowControl/>
+              <w:suppressLineNumbers w:val="0"/>
+              <w:spacing w:before="0" w:beforeAutospacing="0" w:line="12" w:lineRule="atLeast"/>
+              <w:jc w:val="left"/>
+              <w:rPr>
+                <w:rFonts w:hint="default" w:ascii="sans-serif" w:hAnsi="sans-serif" w:eastAsia="sans-serif" w:cs="sans-serif"/>
+              </w:rPr>
+            </w:pPr>
+            <w:r>
+              <w:rPr>
+                <w:rStyle w:val="4"/>
+                <w:rFonts w:hint="default" w:ascii="sans-serif" w:hAnsi="sans-serif" w:eastAsia="sans-serif" w:cs="sans-serif"/>
+                <w:kern w:val="0"/>
+                <w:sz w:val="24"/>
+                <w:szCs w:val="24"/>
+                <w:bdr w:val="none" w:color="auto" w:sz="0" w:space="0"/>
+                <w:lang w:val="en-US" w:eastAsia="zh-CN" w:bidi="ar"/>
+              </w:rPr>
+              <w:t xml:space="preserve">cd api-gateway &amp;&amp; </w:t>
+            </w:r>
+            <w:bookmarkStart w:id="0" w:name="_GoBack"/>
+            <w:r>
+              <w:rPr>
+                <w:rStyle w:val="4"/>
+                <w:rFonts w:hint="default" w:ascii="sans-serif" w:hAnsi="sans-serif" w:eastAsia="sans-serif" w:cs="sans-serif"/>
+                <w:kern w:val="0"/>
+                <w:sz w:val="24"/>
+                <w:szCs w:val="24"/>
+                <w:bdr w:val="none" w:color="auto" w:sz="0" w:space="0"/>
+                <w:lang w:val="en-US" w:eastAsia="zh-CN" w:bidi="ar"/>
+              </w:rPr>
+              <w:t>php artisan serve --port=8000</w:t>
+            </w:r>
+            <w:bookmarkEnd w:id="0"/>
+          </w:p>
+        </w:tc>
+        <w:tc>
+          <w:tcPr>
+            <w:tcW w:w="3517" w:type="dxa"/>
+            <w:tcBorders>
+              <w:top w:val="single" w:color="C4C7C5" w:sz="4" w:space="0"/>
+              <w:left w:val="single" w:color="C4C7C5" w:sz="4" w:space="0"/>
+              <w:bottom w:val="single" w:color="C4C7C5" w:sz="4" w:space="0"/>
+              <w:right w:val="single" w:color="C4C7C5" w:sz="4" w:space="0"/>
+            </w:tcBorders>
+            <w:shd w:val="clear"/>
+            <w:tcMar>
+              <w:top w:w="96" w:type="dxa"/>
+              <w:left w:w="144" w:type="dxa"/>
+              <w:bottom w:w="96" w:type="dxa"/>
+              <w:right w:w="144" w:type="dxa"/>
+            </w:tcMar>
+            <w:vAlign w:val="center"/>
+          </w:tcPr>
+          <w:p>
+            <w:pPr>
+              <w:keepNext w:val="0"/>
+              <w:keepLines w:val="0"/>
+              <w:widowControl/>
+              <w:suppressLineNumbers w:val="0"/>
+              <w:spacing w:before="0" w:beforeAutospacing="0" w:line="12" w:lineRule="atLeast"/>
+              <w:jc w:val="left"/>
+              <w:rPr>
+                <w:rFonts w:hint="default" w:ascii="sans-serif" w:hAnsi="sans-serif" w:eastAsia="sans-serif" w:cs="sans-serif"/>
+              </w:rPr>
+            </w:pPr>
+            <w:r>
+              <w:rPr>
+                <w:rStyle w:val="4"/>
+                <w:rFonts w:hint="default" w:ascii="sans-serif" w:hAnsi="sans-serif" w:eastAsia="sans-serif" w:cs="sans-serif"/>
+                <w:kern w:val="0"/>
+                <w:sz w:val="24"/>
+                <w:szCs w:val="24"/>
+                <w:bdr w:val="none" w:color="auto" w:sz="0" w:space="0"/>
+                <w:lang w:val="en-US" w:eastAsia="zh-CN" w:bidi="ar"/>
+              </w:rPr>
+              <w:t>[http://127.0.0.1:8000](http://127.0.0.1:8000)</w:t>
+            </w:r>
+          </w:p>
+        </w:tc>
+      </w:tr>
+      <w:tr>
+        <w:tblPrEx>
+          <w:tblBorders>
+            <w:top w:val="none" w:color="auto" w:sz="0" w:space="0"/>
+            <w:left w:val="none" w:color="auto" w:sz="0" w:space="0"/>
+            <w:bottom w:val="none" w:color="auto" w:sz="0" w:space="0"/>
+            <w:right w:val="none" w:color="auto" w:sz="0" w:space="0"/>
+            <w:insideH w:val="none" w:color="auto" w:sz="0" w:space="0"/>
+            <w:insideV w:val="none" w:color="auto" w:sz="0" w:space="0"/>
+          </w:tblBorders>
+          <w:tblCellMar>
+            <w:top w:w="15" w:type="dxa"/>
+            <w:left w:w="15" w:type="dxa"/>
+            <w:bottom w:w="15" w:type="dxa"/>
+            <w:right w:w="15" w:type="dxa"/>
+          </w:tblCellMar>
+        </w:tblPrEx>
+        <w:trPr>
+          <w:tblCellSpacing w:w="15" w:type="dxa"/>
+        </w:trPr>
+        <w:tc>
+          <w:tcPr>
+            <w:tcW w:w="1374" w:type="dxa"/>
+            <w:tcBorders>
+              <w:top w:val="single" w:color="C4C7C5" w:sz="4" w:space="0"/>
+              <w:left w:val="single" w:color="C4C7C5" w:sz="4" w:space="0"/>
+              <w:bottom w:val="single" w:color="C4C7C5" w:sz="4" w:space="0"/>
+              <w:right w:val="single" w:color="C4C7C5" w:sz="4" w:space="0"/>
+            </w:tcBorders>
+            <w:shd w:val="clear"/>
+            <w:tcMar>
+              <w:top w:w="96" w:type="dxa"/>
+              <w:left w:w="144" w:type="dxa"/>
+              <w:bottom w:w="96" w:type="dxa"/>
+              <w:right w:w="144" w:type="dxa"/>
+            </w:tcMar>
+            <w:vAlign w:val="center"/>
+          </w:tcPr>
+          <w:p>
+            <w:pPr>
+              <w:keepNext w:val="0"/>
+              <w:keepLines w:val="0"/>
+              <w:widowControl/>
+              <w:suppressLineNumbers w:val="0"/>
+              <w:spacing w:before="0" w:beforeAutospacing="0" w:line="12" w:lineRule="atLeast"/>
+              <w:jc w:val="left"/>
+              <w:rPr>
+                <w:rFonts w:hint="default" w:ascii="sans-serif" w:hAnsi="sans-serif" w:eastAsia="sans-serif" w:cs="sans-serif"/>
+              </w:rPr>
+            </w:pPr>
+            <w:r>
+              <w:rPr>
+                <w:rStyle w:val="4"/>
+                <w:rFonts w:hint="default" w:ascii="sans-serif" w:hAnsi="sans-serif" w:eastAsia="sans-serif" w:cs="sans-serif"/>
+                <w:b/>
+                <w:bCs/>
+                <w:kern w:val="0"/>
+                <w:sz w:val="24"/>
+                <w:szCs w:val="24"/>
+                <w:bdr w:val="none" w:color="auto" w:sz="0" w:space="0"/>
+                <w:lang w:val="en-US" w:eastAsia="zh-CN" w:bidi="ar"/>
+              </w:rPr>
+              <w:t>auth-service</w:t>
+            </w:r>
+          </w:p>
+        </w:tc>
+        <w:tc>
+          <w:tcPr>
+            <w:tcW w:w="3653" w:type="dxa"/>
+            <w:tcBorders>
+              <w:top w:val="single" w:color="C4C7C5" w:sz="4" w:space="0"/>
+              <w:left w:val="single" w:color="C4C7C5" w:sz="4" w:space="0"/>
+              <w:bottom w:val="single" w:color="C4C7C5" w:sz="4" w:space="0"/>
+              <w:right w:val="single" w:color="C4C7C5" w:sz="4" w:space="0"/>
+            </w:tcBorders>
+            <w:shd w:val="clear"/>
+            <w:tcMar>
+              <w:top w:w="96" w:type="dxa"/>
+              <w:left w:w="144" w:type="dxa"/>
+              <w:bottom w:w="96" w:type="dxa"/>
+              <w:right w:w="144" w:type="dxa"/>
+            </w:tcMar>
+            <w:vAlign w:val="center"/>
+          </w:tcPr>
+          <w:p>
+            <w:pPr>
+              <w:keepNext w:val="0"/>
+              <w:keepLines w:val="0"/>
+              <w:widowControl/>
+              <w:suppressLineNumbers w:val="0"/>
+              <w:spacing w:before="0" w:beforeAutospacing="0" w:line="12" w:lineRule="atLeast"/>
+              <w:jc w:val="left"/>
+              <w:rPr>
+                <w:rFonts w:hint="default" w:ascii="sans-serif" w:hAnsi="sans-serif" w:eastAsia="sans-serif" w:cs="sans-serif"/>
+              </w:rPr>
+            </w:pPr>
+            <w:r>
+              <w:rPr>
+                <w:rStyle w:val="4"/>
+                <w:rFonts w:hint="default" w:ascii="sans-serif" w:hAnsi="sans-serif" w:eastAsia="sans-serif" w:cs="sans-serif"/>
+                <w:kern w:val="0"/>
+                <w:sz w:val="24"/>
+                <w:szCs w:val="24"/>
+                <w:bdr w:val="none" w:color="auto" w:sz="0" w:space="0"/>
+                <w:lang w:val="en-US" w:eastAsia="zh-CN" w:bidi="ar"/>
+              </w:rPr>
+              <w:t>cd auth-service &amp;&amp; php artisan serve --port=8001</w:t>
+            </w:r>
+          </w:p>
+        </w:tc>
+        <w:tc>
+          <w:tcPr>
+            <w:tcW w:w="3517" w:type="dxa"/>
+            <w:tcBorders>
+              <w:top w:val="single" w:color="C4C7C5" w:sz="4" w:space="0"/>
+              <w:left w:val="single" w:color="C4C7C5" w:sz="4" w:space="0"/>
+              <w:bottom w:val="single" w:color="C4C7C5" w:sz="4" w:space="0"/>
+              <w:right w:val="single" w:color="C4C7C5" w:sz="4" w:space="0"/>
+            </w:tcBorders>
+            <w:shd w:val="clear"/>
+            <w:tcMar>
+              <w:top w:w="96" w:type="dxa"/>
+              <w:left w:w="144" w:type="dxa"/>
+              <w:bottom w:w="96" w:type="dxa"/>
+              <w:right w:w="144" w:type="dxa"/>
+            </w:tcMar>
+            <w:vAlign w:val="center"/>
+          </w:tcPr>
+          <w:p>
+            <w:pPr>
+              <w:keepNext w:val="0"/>
+              <w:keepLines w:val="0"/>
+              <w:widowControl/>
+              <w:suppressLineNumbers w:val="0"/>
+              <w:spacing w:before="0" w:beforeAutospacing="0" w:line="12" w:lineRule="atLeast"/>
+              <w:jc w:val="left"/>
+              <w:rPr>
+                <w:rFonts w:hint="default" w:ascii="sans-serif" w:hAnsi="sans-serif" w:eastAsia="sans-serif" w:cs="sans-serif"/>
+              </w:rPr>
+            </w:pPr>
+            <w:r>
+              <w:rPr>
+                <w:rStyle w:val="4"/>
+                <w:rFonts w:hint="default" w:ascii="sans-serif" w:hAnsi="sans-serif" w:eastAsia="sans-serif" w:cs="sans-serif"/>
+                <w:kern w:val="0"/>
+                <w:sz w:val="24"/>
+                <w:szCs w:val="24"/>
+                <w:bdr w:val="none" w:color="auto" w:sz="0" w:space="0"/>
+                <w:lang w:val="en-US" w:eastAsia="zh-CN" w:bidi="ar"/>
+              </w:rPr>
+              <w:t>[http://127.0.0.1:8001](http://127.0.0.1:8001)</w:t>
+            </w:r>
+          </w:p>
+        </w:tc>
+      </w:tr>
+      <w:tr>
+        <w:tblPrEx>
+          <w:tblBorders>
+            <w:top w:val="none" w:color="auto" w:sz="0" w:space="0"/>
+            <w:left w:val="none" w:color="auto" w:sz="0" w:space="0"/>
+            <w:bottom w:val="none" w:color="auto" w:sz="0" w:space="0"/>
+            <w:right w:val="none" w:color="auto" w:sz="0" w:space="0"/>
+            <w:insideH w:val="none" w:color="auto" w:sz="0" w:space="0"/>
+            <w:insideV w:val="none" w:color="auto" w:sz="0" w:space="0"/>
+          </w:tblBorders>
+          <w:tblCellMar>
+            <w:top w:w="15" w:type="dxa"/>
+            <w:left w:w="15" w:type="dxa"/>
+            <w:bottom w:w="15" w:type="dxa"/>
+            <w:right w:w="15" w:type="dxa"/>
+          </w:tblCellMar>
+        </w:tblPrEx>
+        <w:trPr>
+          <w:tblCellSpacing w:w="15" w:type="dxa"/>
+        </w:trPr>
+        <w:tc>
+          <w:tcPr>
+            <w:tcW w:w="1374" w:type="dxa"/>
+            <w:tcBorders>
+              <w:top w:val="single" w:color="C4C7C5" w:sz="4" w:space="0"/>
+              <w:left w:val="single" w:color="C4C7C5" w:sz="4" w:space="0"/>
+              <w:bottom w:val="single" w:color="C4C7C5" w:sz="4" w:space="0"/>
+              <w:right w:val="single" w:color="C4C7C5" w:sz="4" w:space="0"/>
+            </w:tcBorders>
+            <w:shd w:val="clear"/>
+            <w:tcMar>
+              <w:top w:w="96" w:type="dxa"/>
+              <w:left w:w="144" w:type="dxa"/>
+              <w:bottom w:w="96" w:type="dxa"/>
+              <w:right w:w="144" w:type="dxa"/>
+            </w:tcMar>
+            <w:vAlign w:val="center"/>
+          </w:tcPr>
+          <w:p>
+            <w:pPr>
+              <w:keepNext w:val="0"/>
+              <w:keepLines w:val="0"/>
+              <w:widowControl/>
+              <w:suppressLineNumbers w:val="0"/>
+              <w:spacing w:before="0" w:beforeAutospacing="0" w:line="12" w:lineRule="atLeast"/>
+              <w:jc w:val="left"/>
+              <w:rPr>
+                <w:rFonts w:hint="default" w:ascii="sans-serif" w:hAnsi="sans-serif" w:eastAsia="sans-serif" w:cs="sans-serif"/>
+              </w:rPr>
+            </w:pPr>
+            <w:r>
+              <w:rPr>
+                <w:rStyle w:val="4"/>
+                <w:rFonts w:hint="default" w:ascii="sans-serif" w:hAnsi="sans-serif" w:eastAsia="sans-serif" w:cs="sans-serif"/>
+                <w:b/>
+                <w:bCs/>
+                <w:kern w:val="0"/>
+                <w:sz w:val="24"/>
+                <w:szCs w:val="24"/>
+                <w:bdr w:val="none" w:color="auto" w:sz="0" w:space="0"/>
+                <w:lang w:val="en-US" w:eastAsia="zh-CN" w:bidi="ar"/>
+              </w:rPr>
+              <w:t>catalog-service</w:t>
+            </w:r>
+          </w:p>
+        </w:tc>
+        <w:tc>
+          <w:tcPr>
+            <w:tcW w:w="3653" w:type="dxa"/>
+            <w:tcBorders>
+              <w:top w:val="single" w:color="C4C7C5" w:sz="4" w:space="0"/>
+              <w:left w:val="single" w:color="C4C7C5" w:sz="4" w:space="0"/>
+              <w:bottom w:val="single" w:color="C4C7C5" w:sz="4" w:space="0"/>
+              <w:right w:val="single" w:color="C4C7C5" w:sz="4" w:space="0"/>
+            </w:tcBorders>
+            <w:shd w:val="clear"/>
+            <w:tcMar>
+              <w:top w:w="96" w:type="dxa"/>
+              <w:left w:w="144" w:type="dxa"/>
+              <w:bottom w:w="96" w:type="dxa"/>
+              <w:right w:w="144" w:type="dxa"/>
+            </w:tcMar>
+            <w:vAlign w:val="center"/>
+          </w:tcPr>
+          <w:p>
+            <w:pPr>
+              <w:keepNext w:val="0"/>
+              <w:keepLines w:val="0"/>
+              <w:widowControl/>
+              <w:suppressLineNumbers w:val="0"/>
+              <w:spacing w:before="0" w:beforeAutospacing="0" w:line="12" w:lineRule="atLeast"/>
+              <w:jc w:val="left"/>
+              <w:rPr>
+                <w:rFonts w:hint="default" w:ascii="sans-serif" w:hAnsi="sans-serif" w:eastAsia="sans-serif" w:cs="sans-serif"/>
+              </w:rPr>
+            </w:pPr>
+            <w:r>
+              <w:rPr>
+                <w:rStyle w:val="4"/>
+                <w:rFonts w:hint="default" w:ascii="sans-serif" w:hAnsi="sans-serif" w:eastAsia="sans-serif" w:cs="sans-serif"/>
+                <w:kern w:val="0"/>
+                <w:sz w:val="24"/>
+                <w:szCs w:val="24"/>
+                <w:bdr w:val="none" w:color="auto" w:sz="0" w:space="0"/>
+                <w:lang w:val="en-US" w:eastAsia="zh-CN" w:bidi="ar"/>
+              </w:rPr>
+              <w:t>cd catalog-service &amp;&amp; php artisan serve --port=8002</w:t>
+            </w:r>
+          </w:p>
+        </w:tc>
+        <w:tc>
+          <w:tcPr>
+            <w:tcW w:w="3517" w:type="dxa"/>
+            <w:tcBorders>
+              <w:top w:val="single" w:color="C4C7C5" w:sz="4" w:space="0"/>
+              <w:left w:val="single" w:color="C4C7C5" w:sz="4" w:space="0"/>
+              <w:bottom w:val="single" w:color="C4C7C5" w:sz="4" w:space="0"/>
+              <w:right w:val="single" w:color="C4C7C5" w:sz="4" w:space="0"/>
+            </w:tcBorders>
+            <w:shd w:val="clear"/>
+            <w:tcMar>
+              <w:top w:w="96" w:type="dxa"/>
+              <w:left w:w="144" w:type="dxa"/>
+              <w:bottom w:w="96" w:type="dxa"/>
+              <w:right w:w="144" w:type="dxa"/>
+            </w:tcMar>
+            <w:vAlign w:val="center"/>
+          </w:tcPr>
+          <w:p>
+            <w:pPr>
+              <w:keepNext w:val="0"/>
+              <w:keepLines w:val="0"/>
+              <w:widowControl/>
+              <w:suppressLineNumbers w:val="0"/>
+              <w:spacing w:before="0" w:beforeAutospacing="0" w:line="12" w:lineRule="atLeast"/>
+              <w:jc w:val="left"/>
+              <w:rPr>
+                <w:rFonts w:hint="default" w:ascii="sans-serif" w:hAnsi="sans-serif" w:eastAsia="sans-serif" w:cs="sans-serif"/>
+              </w:rPr>
+            </w:pPr>
+            <w:r>
+              <w:rPr>
+                <w:rStyle w:val="4"/>
+                <w:rFonts w:hint="default" w:ascii="sans-serif" w:hAnsi="sans-serif" w:eastAsia="sans-serif" w:cs="sans-serif"/>
+                <w:kern w:val="0"/>
+                <w:sz w:val="24"/>
+                <w:szCs w:val="24"/>
+                <w:bdr w:val="none" w:color="auto" w:sz="0" w:space="0"/>
+                <w:lang w:val="en-US" w:eastAsia="zh-CN" w:bidi="ar"/>
+              </w:rPr>
+              <w:t>[http://127.0.0.1:8002](http://127.0.0.1:8002)</w:t>
+            </w:r>
+          </w:p>
+        </w:tc>
+      </w:tr>
+      <w:tr>
+        <w:tblPrEx>
+          <w:tblBorders>
+            <w:top w:val="none" w:color="auto" w:sz="0" w:space="0"/>
+            <w:left w:val="none" w:color="auto" w:sz="0" w:space="0"/>
+            <w:bottom w:val="none" w:color="auto" w:sz="0" w:space="0"/>
+            <w:right w:val="none" w:color="auto" w:sz="0" w:space="0"/>
+            <w:insideH w:val="none" w:color="auto" w:sz="0" w:space="0"/>
+            <w:insideV w:val="none" w:color="auto" w:sz="0" w:space="0"/>
+          </w:tblBorders>
+          <w:tblCellMar>
+            <w:top w:w="15" w:type="dxa"/>
+            <w:left w:w="15" w:type="dxa"/>
+            <w:bottom w:w="15" w:type="dxa"/>
+            <w:right w:w="15" w:type="dxa"/>
+          </w:tblCellMar>
+        </w:tblPrEx>
+        <w:trPr>
+          <w:tblCellSpacing w:w="15" w:type="dxa"/>
+        </w:trPr>
+        <w:tc>
+          <w:tcPr>
+            <w:tcW w:w="1374" w:type="dxa"/>
+            <w:tcBorders>
+              <w:top w:val="single" w:color="C4C7C5" w:sz="4" w:space="0"/>
+              <w:left w:val="single" w:color="C4C7C5" w:sz="4" w:space="0"/>
+              <w:bottom w:val="single" w:color="C4C7C5" w:sz="4" w:space="0"/>
+              <w:right w:val="single" w:color="C4C7C5" w:sz="4" w:space="0"/>
+            </w:tcBorders>
+            <w:shd w:val="clear"/>
+            <w:tcMar>
+              <w:top w:w="96" w:type="dxa"/>
+              <w:left w:w="144" w:type="dxa"/>
+              <w:bottom w:w="96" w:type="dxa"/>
+              <w:right w:w="144" w:type="dxa"/>
+            </w:tcMar>
+            <w:vAlign w:val="center"/>
+          </w:tcPr>
+          <w:p>
+            <w:pPr>
+              <w:keepNext w:val="0"/>
+              <w:keepLines w:val="0"/>
+              <w:widowControl/>
+              <w:suppressLineNumbers w:val="0"/>
+              <w:spacing w:before="0" w:beforeAutospacing="0" w:line="12" w:lineRule="atLeast"/>
+              <w:jc w:val="left"/>
+              <w:rPr>
+                <w:rFonts w:hint="default" w:ascii="sans-serif" w:hAnsi="sans-serif" w:eastAsia="sans-serif" w:cs="sans-serif"/>
+              </w:rPr>
+            </w:pPr>
+            <w:r>
+              <w:rPr>
+                <w:rStyle w:val="4"/>
+                <w:rFonts w:hint="default" w:ascii="sans-serif" w:hAnsi="sans-serif" w:eastAsia="sans-serif" w:cs="sans-serif"/>
+                <w:b/>
+                <w:bCs/>
+                <w:kern w:val="0"/>
+                <w:sz w:val="24"/>
+                <w:szCs w:val="24"/>
+                <w:bdr w:val="none" w:color="auto" w:sz="0" w:space="0"/>
+                <w:lang w:val="en-US" w:eastAsia="zh-CN" w:bidi="ar"/>
+              </w:rPr>
+              <w:t>order-service</w:t>
+            </w:r>
+          </w:p>
+        </w:tc>
+        <w:tc>
+          <w:tcPr>
+            <w:tcW w:w="3653" w:type="dxa"/>
+            <w:tcBorders>
+              <w:top w:val="single" w:color="C4C7C5" w:sz="4" w:space="0"/>
+              <w:left w:val="single" w:color="C4C7C5" w:sz="4" w:space="0"/>
+              <w:bottom w:val="single" w:color="C4C7C5" w:sz="4" w:space="0"/>
+              <w:right w:val="single" w:color="C4C7C5" w:sz="4" w:space="0"/>
+            </w:tcBorders>
+            <w:shd w:val="clear"/>
+            <w:tcMar>
+              <w:top w:w="96" w:type="dxa"/>
+              <w:left w:w="144" w:type="dxa"/>
+              <w:bottom w:w="96" w:type="dxa"/>
+              <w:right w:w="144" w:type="dxa"/>
+            </w:tcMar>
+            <w:vAlign w:val="center"/>
+          </w:tcPr>
+          <w:p>
+            <w:pPr>
+              <w:keepNext w:val="0"/>
+              <w:keepLines w:val="0"/>
+              <w:widowControl/>
+              <w:suppressLineNumbers w:val="0"/>
+              <w:spacing w:before="0" w:beforeAutospacing="0" w:line="12" w:lineRule="atLeast"/>
+              <w:jc w:val="left"/>
+              <w:rPr>
+                <w:rFonts w:hint="default" w:ascii="sans-serif" w:hAnsi="sans-serif" w:eastAsia="sans-serif" w:cs="sans-serif"/>
+              </w:rPr>
+            </w:pPr>
+            <w:r>
+              <w:rPr>
+                <w:rStyle w:val="4"/>
+                <w:rFonts w:hint="default" w:ascii="sans-serif" w:hAnsi="sans-serif" w:eastAsia="sans-serif" w:cs="sans-serif"/>
+                <w:kern w:val="0"/>
+                <w:sz w:val="24"/>
+                <w:szCs w:val="24"/>
+                <w:bdr w:val="none" w:color="auto" w:sz="0" w:space="0"/>
+                <w:lang w:val="en-US" w:eastAsia="zh-CN" w:bidi="ar"/>
+              </w:rPr>
+              <w:t>cd order-service &amp;&amp; php artisan serve --port=8003</w:t>
+            </w:r>
+          </w:p>
+        </w:tc>
+        <w:tc>
+          <w:tcPr>
+            <w:tcW w:w="3517" w:type="dxa"/>
+            <w:tcBorders>
+              <w:top w:val="single" w:color="C4C7C5" w:sz="4" w:space="0"/>
+              <w:left w:val="single" w:color="C4C7C5" w:sz="4" w:space="0"/>
+              <w:bottom w:val="single" w:color="C4C7C5" w:sz="4" w:space="0"/>
+              <w:right w:val="single" w:color="C4C7C5" w:sz="4" w:space="0"/>
+            </w:tcBorders>
+            <w:shd w:val="clear"/>
+            <w:tcMar>
+              <w:top w:w="96" w:type="dxa"/>
+              <w:left w:w="144" w:type="dxa"/>
+              <w:bottom w:w="96" w:type="dxa"/>
+              <w:right w:w="144" w:type="dxa"/>
+            </w:tcMar>
+            <w:vAlign w:val="center"/>
+          </w:tcPr>
+          <w:p>
+            <w:pPr>
+              <w:keepNext w:val="0"/>
+              <w:keepLines w:val="0"/>
+              <w:widowControl/>
+              <w:suppressLineNumbers w:val="0"/>
+              <w:spacing w:before="0" w:beforeAutospacing="0" w:line="12" w:lineRule="atLeast"/>
+              <w:jc w:val="left"/>
+              <w:rPr>
+                <w:rFonts w:hint="default" w:ascii="sans-serif" w:hAnsi="sans-serif" w:eastAsia="sans-serif" w:cs="sans-serif"/>
+              </w:rPr>
+            </w:pPr>
+            <w:r>
+              <w:rPr>
+                <w:rStyle w:val="4"/>
+                <w:rFonts w:hint="default" w:ascii="sans-serif" w:hAnsi="sans-serif" w:eastAsia="sans-serif" w:cs="sans-serif"/>
+                <w:kern w:val="0"/>
+                <w:sz w:val="24"/>
+                <w:szCs w:val="24"/>
+                <w:bdr w:val="none" w:color="auto" w:sz="0" w:space="0"/>
+                <w:lang w:val="en-US" w:eastAsia="zh-CN" w:bidi="ar"/>
+              </w:rPr>
+              <w:t>[http://127.0.0.1:8003](http://127.0.0.1:8003)</w:t>
+            </w:r>
+          </w:p>
+        </w:tc>
+      </w:tr>
+      <w:tr>
+        <w:tblPrEx>
+          <w:tblBorders>
+            <w:top w:val="none" w:color="auto" w:sz="0" w:space="0"/>
+            <w:left w:val="none" w:color="auto" w:sz="0" w:space="0"/>
+            <w:bottom w:val="none" w:color="auto" w:sz="0" w:space="0"/>
+            <w:right w:val="none" w:color="auto" w:sz="0" w:space="0"/>
+            <w:insideH w:val="none" w:color="auto" w:sz="0" w:space="0"/>
+            <w:insideV w:val="none" w:color="auto" w:sz="0" w:space="0"/>
+          </w:tblBorders>
+          <w:shd w:val="clear"/>
+          <w:tblCellMar>
+            <w:top w:w="15" w:type="dxa"/>
+            <w:left w:w="15" w:type="dxa"/>
+            <w:bottom w:w="15" w:type="dxa"/>
+            <w:right w:w="15" w:type="dxa"/>
+          </w:tblCellMar>
+        </w:tblPrEx>
+        <w:trPr>
+          <w:tblCellSpacing w:w="15" w:type="dxa"/>
+        </w:trPr>
+        <w:tc>
+          <w:tcPr>
+            <w:tcW w:w="1374" w:type="dxa"/>
+            <w:tcBorders>
+              <w:top w:val="single" w:color="C4C7C5" w:sz="4" w:space="0"/>
+              <w:left w:val="single" w:color="C4C7C5" w:sz="4" w:space="0"/>
+              <w:bottom w:val="single" w:color="C4C7C5" w:sz="4" w:space="0"/>
+              <w:right w:val="single" w:color="C4C7C5" w:sz="4" w:space="0"/>
+            </w:tcBorders>
+            <w:shd w:val="clear"/>
+            <w:tcMar>
+              <w:top w:w="96" w:type="dxa"/>
+              <w:left w:w="144" w:type="dxa"/>
+              <w:bottom w:w="96" w:type="dxa"/>
+              <w:right w:w="144" w:type="dxa"/>
+            </w:tcMar>
+            <w:vAlign w:val="center"/>
+          </w:tcPr>
+          <w:p>
+            <w:pPr>
+              <w:keepNext w:val="0"/>
+              <w:keepLines w:val="0"/>
+              <w:widowControl/>
+              <w:suppressLineNumbers w:val="0"/>
+              <w:spacing w:before="0" w:beforeAutospacing="0" w:line="12" w:lineRule="atLeast"/>
+              <w:jc w:val="left"/>
+              <w:rPr>
+                <w:rFonts w:hint="default" w:ascii="sans-serif" w:hAnsi="sans-serif" w:eastAsia="sans-serif" w:cs="sans-serif"/>
+              </w:rPr>
+            </w:pPr>
+            <w:r>
+              <w:rPr>
+                <w:rStyle w:val="4"/>
+                <w:rFonts w:hint="default" w:ascii="sans-serif" w:hAnsi="sans-serif" w:eastAsia="sans-serif" w:cs="sans-serif"/>
+                <w:b/>
+                <w:bCs/>
+                <w:kern w:val="0"/>
+                <w:sz w:val="24"/>
+                <w:szCs w:val="24"/>
+                <w:bdr w:val="none" w:color="auto" w:sz="0" w:space="0"/>
+                <w:lang w:val="en-US" w:eastAsia="zh-CN" w:bidi="ar"/>
+              </w:rPr>
+              <w:t>payment-service</w:t>
+            </w:r>
+          </w:p>
+        </w:tc>
+        <w:tc>
+          <w:tcPr>
+            <w:tcW w:w="3653" w:type="dxa"/>
+            <w:tcBorders>
+              <w:top w:val="single" w:color="C4C7C5" w:sz="4" w:space="0"/>
+              <w:left w:val="single" w:color="C4C7C5" w:sz="4" w:space="0"/>
+              <w:bottom w:val="single" w:color="C4C7C5" w:sz="4" w:space="0"/>
+              <w:right w:val="single" w:color="C4C7C5" w:sz="4" w:space="0"/>
+            </w:tcBorders>
+            <w:shd w:val="clear"/>
+            <w:tcMar>
+              <w:top w:w="96" w:type="dxa"/>
+              <w:left w:w="144" w:type="dxa"/>
+              <w:bottom w:w="96" w:type="dxa"/>
+              <w:right w:w="144" w:type="dxa"/>
+            </w:tcMar>
+            <w:vAlign w:val="center"/>
+          </w:tcPr>
+          <w:p>
+            <w:pPr>
+              <w:keepNext w:val="0"/>
+              <w:keepLines w:val="0"/>
+              <w:widowControl/>
+              <w:suppressLineNumbers w:val="0"/>
+              <w:spacing w:before="0" w:beforeAutospacing="0" w:line="12" w:lineRule="atLeast"/>
+              <w:jc w:val="left"/>
+              <w:rPr>
+                <w:rFonts w:hint="default" w:ascii="sans-serif" w:hAnsi="sans-serif" w:eastAsia="sans-serif" w:cs="sans-serif"/>
+              </w:rPr>
+            </w:pPr>
+            <w:r>
+              <w:rPr>
+                <w:rStyle w:val="4"/>
+                <w:rFonts w:hint="default" w:ascii="sans-serif" w:hAnsi="sans-serif" w:eastAsia="sans-serif" w:cs="sans-serif"/>
+                <w:kern w:val="0"/>
+                <w:sz w:val="24"/>
+                <w:szCs w:val="24"/>
+                <w:bdr w:val="none" w:color="auto" w:sz="0" w:space="0"/>
+                <w:lang w:val="en-US" w:eastAsia="zh-CN" w:bidi="ar"/>
+              </w:rPr>
+              <w:t>cd payment-service &amp;&amp; php artisan serve --port=8004</w:t>
+            </w:r>
+          </w:p>
+        </w:tc>
+        <w:tc>
+          <w:tcPr>
+            <w:tcW w:w="3517" w:type="dxa"/>
+            <w:tcBorders>
+              <w:top w:val="single" w:color="C4C7C5" w:sz="4" w:space="0"/>
+              <w:left w:val="single" w:color="C4C7C5" w:sz="4" w:space="0"/>
+              <w:bottom w:val="single" w:color="C4C7C5" w:sz="4" w:space="0"/>
+              <w:right w:val="single" w:color="C4C7C5" w:sz="4" w:space="0"/>
+            </w:tcBorders>
+            <w:shd w:val="clear"/>
+            <w:tcMar>
+              <w:top w:w="96" w:type="dxa"/>
+              <w:left w:w="144" w:type="dxa"/>
+              <w:bottom w:w="96" w:type="dxa"/>
+              <w:right w:w="144" w:type="dxa"/>
+            </w:tcMar>
+            <w:vAlign w:val="center"/>
+          </w:tcPr>
+          <w:p>
+            <w:pPr>
+              <w:keepNext w:val="0"/>
+              <w:keepLines w:val="0"/>
+              <w:widowControl/>
+              <w:suppressLineNumbers w:val="0"/>
+              <w:spacing w:before="0" w:beforeAutospacing="0" w:line="12" w:lineRule="atLeast"/>
+              <w:jc w:val="left"/>
+              <w:rPr>
+                <w:rFonts w:hint="default" w:ascii="sans-serif" w:hAnsi="sans-serif" w:eastAsia="sans-serif" w:cs="sans-serif"/>
+              </w:rPr>
+            </w:pPr>
+            <w:r>
+              <w:rPr>
+                <w:rStyle w:val="4"/>
+                <w:rFonts w:hint="default" w:ascii="sans-serif" w:hAnsi="sans-serif" w:eastAsia="sans-serif" w:cs="sans-serif"/>
+                <w:kern w:val="0"/>
+                <w:sz w:val="24"/>
+                <w:szCs w:val="24"/>
+                <w:bdr w:val="none" w:color="auto" w:sz="0" w:space="0"/>
+                <w:lang w:val="en-US" w:eastAsia="zh-CN" w:bidi="ar"/>
+              </w:rPr>
+              <w:t>[http://127.0.0.1:8004](http://127.0.0.1:8004)</w:t>
+            </w:r>
+          </w:p>
+        </w:tc>
+      </w:tr>
+    </w:tbl>
+    <w:p>
+      <w:pPr>
+        <w:rPr>
+          <w:rFonts w:hint="default"/>
+          <w:lang w:val="en-US"/>
+        </w:rPr>
+      </w:pPr>
     </w:p>
     <w:sectPr>
       <w:pgSz w:w="11906" w:h="16838"/>
@@ -9962,6 +11939,16 @@
       <w:szCs w:val="20"/>
     </w:rPr>
   </w:style>
+  <w:style w:type="character" w:styleId="5">
+    <w:name w:val="Strong"/>
+    <w:basedOn w:val="2"/>
+    <w:qFormat/>
+    <w:uiPriority w:val="0"/>
+    <w:rPr>
+      <w:b/>
+      <w:bCs/>
+    </w:rPr>
+  </w:style>
 </w:styles>
 </file>
 

</xml_diff>